<commit_message>
Restore separate cover page from original report; body starts on page 2
Co-Authored-By: Claude Sonnet 5.5 <noreply@anthropic.com>
Claude-Session: https://claude.ai/code/session_01J8wCDpxWDW7SzPHcYaZPKT
</commit_message>
<xml_diff>
--- a/report/QCNN_Mid_updated.docx
+++ b/report/QCNN_Mid_updated.docx
@@ -4,13 +4,128 @@
   <w:body>
     <w:p>
       <w:pPr>
-        <w:spacing w:after="20"/>
+        <w:pBdr>
+          <w:bottom w:val="single" w:color="2E6E8E" w:sz="6" w:space="6"/>
+        </w:pBdr>
+        <w:spacing w:after="240" w:before="0" w:line="276"/>
+        <w:jc w:val="center"/>
+      </w:pPr>
+      <w:r>
+        <w:rPr>
+          <w:rFonts w:ascii="Times New Roman" w:cs="Times New Roman" w:eastAsia="Times New Roman" w:hAnsi="Times New Roman"/>
+          <w:b w:val="false"/>
+          <w:bCs w:val="false"/>
+          <w:sz w:val="28"/>
+          <w:szCs w:val="28"/>
+        </w:rPr>
+        <w:t xml:space="preserve">B. Tech. PROJECT REPORT (Mid-Semester Evaluation)</w:t>
+      </w:r>
+    </w:p>
+    <w:p>
+      <w:pPr>
+        <w:spacing w:after="0" w:before="500" w:line="276"/>
+        <w:jc w:val="center"/>
+      </w:pPr>
+      <w:r>
+        <w:rPr>
+          <w:rFonts w:ascii="Times New Roman" w:cs="Times New Roman" w:eastAsia="Times New Roman" w:hAnsi="Times New Roman"/>
+          <w:b/>
+          <w:bCs/>
+          <w:sz w:val="28"/>
+          <w:szCs w:val="28"/>
+        </w:rPr>
+        <w:t xml:space="preserve">QUANTUM FACE RECOGNITION WITH MULTI-GATE QUANTUM CONVOLUTIONAL NEURAL NETWORK</w:t>
+      </w:r>
+    </w:p>
+    <w:p>
+      <w:pPr>
+        <w:spacing w:after="0" w:before="900" w:line="276"/>
+        <w:jc w:val="center"/>
+      </w:pPr>
+      <w:r>
+        <w:rPr>
+          <w:rFonts w:ascii="Times New Roman" w:cs="Times New Roman" w:eastAsia="Times New Roman" w:hAnsi="Times New Roman"/>
+          <w:b/>
+          <w:bCs/>
+          <w:sz w:val="28"/>
+          <w:szCs w:val="28"/>
+        </w:rPr>
+        <w:t xml:space="preserve">Submitted by:</w:t>
+      </w:r>
+    </w:p>
+    <w:p>
+      <w:pPr>
+        <w:spacing w:after="0" w:before="600" w:line="276"/>
+        <w:jc w:val="center"/>
+      </w:pPr>
+      <w:r>
+        <w:rPr>
+          <w:rFonts w:ascii="Times New Roman" w:cs="Times New Roman" w:eastAsia="Times New Roman" w:hAnsi="Times New Roman"/>
+          <w:b/>
+          <w:bCs/>
+          <w:sz w:val="28"/>
+          <w:szCs w:val="28"/>
+        </w:rPr>
+        <w:t xml:space="preserve">Subrata Lodh (2314051),</w:t>
+      </w:r>
+    </w:p>
+    <w:p>
+      <w:pPr>
+        <w:spacing w:after="0" w:before="0" w:line="276"/>
+        <w:jc w:val="center"/>
+      </w:pPr>
+      <w:r>
+        <w:rPr>
+          <w:rFonts w:ascii="Times New Roman" w:cs="Times New Roman" w:eastAsia="Times New Roman" w:hAnsi="Times New Roman"/>
+          <w:b/>
+          <w:bCs/>
+          <w:sz w:val="28"/>
+          <w:szCs w:val="28"/>
+        </w:rPr>
+        <w:t xml:space="preserve">Yesh Agarwal (2314080)</w:t>
+      </w:r>
+    </w:p>
+    <w:p>
+      <w:pPr>
+        <w:spacing w:after="0" w:before="1500" w:line="276"/>
+        <w:jc w:val="center"/>
+      </w:pPr>
+      <w:r>
+        <w:rPr>
+          <w:rFonts w:ascii="Times New Roman" w:cs="Times New Roman" w:eastAsia="Times New Roman" w:hAnsi="Times New Roman"/>
+          <w:b/>
+          <w:bCs/>
+          <w:sz w:val="28"/>
+          <w:szCs w:val="28"/>
+        </w:rPr>
+        <w:t xml:space="preserve">SUPERVISOR NAME: Dr. Banani Basu</w:t>
+      </w:r>
+    </w:p>
+    <w:p>
+      <w:pPr>
+        <w:spacing w:after="0" w:before="800" w:line="276"/>
+        <w:jc w:val="center"/>
+      </w:pPr>
+      <w:r>
+        <w:rPr>
+          <w:rFonts w:ascii="Times New Roman" w:cs="Times New Roman" w:eastAsia="Times New Roman" w:hAnsi="Times New Roman"/>
+          <w:b/>
+          <w:bCs/>
+          <w:sz w:val="28"/>
+          <w:szCs w:val="28"/>
+        </w:rPr>
+        <w:t xml:space="preserve">SUPERVISOR’S SIGNATURE</w:t>
+      </w:r>
+    </w:p>
+    <w:p>
+      <w:pPr>
+        <w:spacing w:after="300" w:before="300"/>
         <w:jc w:val="center"/>
       </w:pPr>
       <w:r>
         <w:drawing>
           <wp:inline distT="0" distB="0" distL="0" distR="0">
-            <wp:extent cx="552450" cy="552450"/>
+            <wp:extent cx="1828800" cy="1828800"/>
             <wp:effectExtent t="0" r="0" b="0" l="0"/>
             <wp:docPr id="1" name="" descr="" title=""/>
             <wp:cNvGraphicFramePr>
@@ -35,7 +150,7 @@
                   <pic:spPr bwMode="auto">
                     <a:xfrm>
                       <a:off x="0" y="0"/>
-                      <a:ext cx="552450" cy="552450"/>
+                      <a:ext cx="1828800" cy="1828800"/>
                     </a:xfrm>
                     <a:prstGeom prst="rect">
                       <a:avLst/>
@@ -50,7 +165,7 @@
     </w:p>
     <w:p>
       <w:pPr>
-        <w:spacing w:after="0" w:before="0" w:line="240"/>
+        <w:spacing w:after="0" w:before="400" w:line="276"/>
         <w:jc w:val="center"/>
       </w:pPr>
       <w:r>
@@ -58,29 +173,15 @@
           <w:rFonts w:ascii="Times New Roman" w:cs="Times New Roman" w:eastAsia="Times New Roman" w:hAnsi="Times New Roman"/>
           <w:b/>
           <w:bCs/>
-          <w:sz w:val="19"/>
-          <w:szCs w:val="19"/>
-        </w:rPr>
-        <w:t xml:space="preserve">NATIONAL INSTITUTE OF TECHNOLOGY SILCHAR, ASSAM (INDIA) – 788010</w:t>
-      </w:r>
-    </w:p>
-    <w:p>
-      <w:pPr>
-        <w:spacing w:after="60" w:before="0" w:line="240"/>
-        <w:jc w:val="center"/>
-      </w:pPr>
-      <w:r>
-        <w:rPr>
-          <w:rFonts w:ascii="Times New Roman" w:cs="Times New Roman" w:eastAsia="Times New Roman" w:hAnsi="Times New Roman"/>
-          <w:sz w:val="19"/>
-          <w:szCs w:val="19"/>
+          <w:sz w:val="28"/>
+          <w:szCs w:val="28"/>
         </w:rPr>
         <w:t xml:space="preserve">DEPARTMENT OF ELECTRONICS AND COMMUNICATION ENGINEERING</w:t>
       </w:r>
     </w:p>
     <w:p>
       <w:pPr>
-        <w:spacing w:after="20" w:before="0" w:line="240"/>
+        <w:spacing w:after="0" w:before="500" w:line="276"/>
         <w:jc w:val="center"/>
       </w:pPr>
       <w:r>
@@ -88,41 +189,21 @@
           <w:rFonts w:ascii="Times New Roman" w:cs="Times New Roman" w:eastAsia="Times New Roman" w:hAnsi="Times New Roman"/>
           <w:b/>
           <w:bCs/>
-          <w:sz w:val="22"/>
-          <w:szCs w:val="22"/>
-        </w:rPr>
-        <w:t xml:space="preserve">B. Tech. PROJECT REPORT (Mid-Semester Evaluation)</w:t>
-      </w:r>
-    </w:p>
-    <w:p>
-      <w:pPr>
-        <w:spacing w:after="40" w:before="0" w:line="240"/>
-        <w:jc w:val="center"/>
-      </w:pPr>
-      <w:r>
-        <w:rPr>
-          <w:rFonts w:ascii="Times New Roman" w:cs="Times New Roman" w:eastAsia="Times New Roman" w:hAnsi="Times New Roman"/>
-          <w:b/>
-          <w:bCs/>
-          <w:sz w:val="26"/>
-          <w:szCs w:val="26"/>
-        </w:rPr>
-        <w:t xml:space="preserve">QUANTUM FACE RECOGNITION WITH MULTI-GATE QUANTUM CONVOLUTIONAL NEURAL NETWORK</w:t>
-      </w:r>
-    </w:p>
-    <w:p>
-      <w:pPr>
-        <w:spacing w:after="90" w:before="0" w:line="240"/>
-        <w:jc w:val="center"/>
-      </w:pPr>
-      <w:r>
-        <w:rPr>
-          <w:rFonts w:ascii="Times New Roman" w:cs="Times New Roman" w:eastAsia="Times New Roman" w:hAnsi="Times New Roman"/>
-          <w:sz w:val="19"/>
-          <w:szCs w:val="19"/>
-        </w:rPr>
-        <w:t xml:space="preserve">Submitted by: Subrata Lodh (2314051), Yesh Agarwal (2314080)   |   Supervisor: Dr. Banani Basu   |   Supervisor’s signature: ____________</w:t>
-      </w:r>
+          <w:sz w:val="28"/>
+          <w:szCs w:val="28"/>
+        </w:rPr>
+        <w:t xml:space="preserve">NATIONAL INSTITUTE OF TECHNOLOGY SILCHAR, ASSAM (INDIA)-788010</w:t>
+      </w:r>
+    </w:p>
+    <w:p>
+      <w:pPr>
+        <w:sectPr>
+          <w:pgSz w:w="12240" w:h="15840" w:orient="portrait"/>
+          <w:pgMar w:top="1440" w:right="1800" w:bottom="1440" w:left="1800" w:header="708" w:footer="708" w:gutter="0"/>
+          <w:pgNumType/>
+          <w:docGrid w:linePitch="360"/>
+        </w:sectPr>
+      </w:pPr>
     </w:p>
     <w:p>
       <w:pPr>
@@ -10332,9 +10413,10 @@
     </w:p>
     <w:sectPr>
       <w:footerReference w:type="default" r:id="rId7"/>
+      <w:type w:val="nextPage"/>
       <w:pgSz w:w="12240" w:h="15840" w:orient="portrait"/>
       <w:pgMar w:top="900" w:right="1300" w:bottom="900" w:left="1300" w:header="708" w:footer="708" w:gutter="0"/>
-      <w:pgNumType/>
+      <w:pgNumType w:start="1"/>
       <w:docGrid w:linePitch="360"/>
     </w:sectPr>
   </w:body>

</xml_diff>

<commit_message>
Restore original per-seed min-max vs Gaussian figure; renumber figures
Co-Authored-By: Claude Sonnet 5.5 <noreply@anthropic.com>
Claude-Session: https://claude.ai/code/session_01J8wCDpxWDW7SzPHcYaZPKT
</commit_message>
<xml_diff>
--- a/report/QCNN_Mid_updated.docx
+++ b/report/QCNN_Mid_updated.docx
@@ -5358,7 +5358,7 @@
           <w:sz w:val="20"/>
           <w:szCs w:val="20"/>
         </w:rPr>
-        <w:t xml:space="preserve">Table 2 and Fig. 6 give the 1000-shot test accuracy of each split. On ORL the mean is 94.667% (max 97.500%, std 1.675). On Yale the original set-up (full-frame resize, lr 10</w:t>
+        <w:t xml:space="preserve">Table 2, Fig. 6 and Fig. 7 give the 1000-shot test accuracy of each split. On ORL the mean is 94.667% (max 97.500%, std 1.675). On Yale the original set-up (full-frame resize, lr 10</w:t>
       </w:r>
       <w:r>
         <w:rPr>
@@ -8287,7 +8287,7 @@
       <w:r>
         <w:drawing>
           <wp:inline distT="0" distB="0" distL="0" distR="0">
-            <wp:extent cx="4476750" cy="1352550"/>
+            <wp:extent cx="4752975" cy="1847850"/>
             <wp:effectExtent t="0" r="0" b="0" l="0"/>
             <wp:docPr id="1" name="" descr="" title=""/>
             <wp:cNvGraphicFramePr>
@@ -8312,7 +8312,7 @@
                   <pic:spPr bwMode="auto">
                     <a:xfrm>
                       <a:off x="0" y="0"/>
-                      <a:ext cx="4476750" cy="1352550"/>
+                      <a:ext cx="4752975" cy="1847850"/>
                     </a:xfrm>
                     <a:prstGeom prst="rect">
                       <a:avLst/>
@@ -8346,121 +8346,7 @@
           <w:sz w:val="18"/>
           <w:szCs w:val="18"/>
         </w:rPr>
-        <w:t xml:space="preserve"> Distribution of the ten per-seed test accuracies (box = quartiles, dots = seeds; mean ± std at right).</w:t>
-      </w:r>
-    </w:p>
-    <w:p>
-      <w:pPr>
-        <w:keepNext/>
-        <w:spacing w:after="40" w:before="80"/>
-      </w:pPr>
-      <w:r>
-        <w:rPr>
-          <w:rFonts w:ascii="Times New Roman" w:cs="Times New Roman" w:eastAsia="Times New Roman" w:hAnsi="Times New Roman"/>
-          <w:b/>
-          <w:bCs/>
-          <w:i/>
-          <w:iCs/>
-          <w:sz w:val="20"/>
-          <w:szCs w:val="20"/>
-        </w:rPr>
-        <w:t xml:space="preserve">4.3 Yale tuning and augmentation study</w:t>
-      </w:r>
-    </w:p>
-    <w:p>
-      <w:pPr>
-        <w:spacing w:after="70" w:before="0" w:line="240"/>
-        <w:jc w:val="both"/>
-      </w:pPr>
-      <w:r>
-        <w:rPr>
-          <w:rFonts w:ascii="Times New Roman" w:cs="Times New Roman" w:eastAsia="Times New Roman" w:hAnsi="Times New Roman"/>
-          <w:sz w:val="20"/>
-          <w:szCs w:val="20"/>
-        </w:rPr>
-        <w:t xml:space="preserve">Because the original Yale result was low, pre-processing (full-frame resize, centre square crop, tighter 80% crop), learning rate (10</w:t>
-      </w:r>
-      <w:r>
-        <w:rPr>
-          <w:rFonts w:ascii="Times New Roman" w:cs="Times New Roman" w:eastAsia="Times New Roman" w:hAnsi="Times New Roman"/>
-          <w:sz w:val="20"/>
-          <w:szCs w:val="20"/>
-          <w:vertAlign w:val="superscript"/>
-        </w:rPr>
-        <w:t xml:space="preserve">−4</w:t>
-      </w:r>
-      <w:r>
-        <w:rPr>
-          <w:rFonts w:ascii="Times New Roman" w:cs="Times New Roman" w:eastAsia="Times New Roman" w:hAnsi="Times New Roman"/>
-          <w:sz w:val="20"/>
-          <w:szCs w:val="20"/>
-        </w:rPr>
-        <w:t xml:space="preserve"> or 10</w:t>
-      </w:r>
-      <w:r>
-        <w:rPr>
-          <w:rFonts w:ascii="Times New Roman" w:cs="Times New Roman" w:eastAsia="Times New Roman" w:hAnsi="Times New Roman"/>
-          <w:sz w:val="20"/>
-          <w:szCs w:val="20"/>
-          <w:vertAlign w:val="superscript"/>
-        </w:rPr>
-        <w:t xml:space="preserve">−3</w:t>
-      </w:r>
-      <w:r>
-        <w:rPr>
-          <w:rFonts w:ascii="Times New Roman" w:cs="Times New Roman" w:eastAsia="Times New Roman" w:hAnsi="Times New Roman"/>
-          <w:sz w:val="20"/>
-          <w:szCs w:val="20"/>
-        </w:rPr>
-        <w:t xml:space="preserve">) and epochs (30 or 60) were varied on a validation split (96 training / 24 validation images from the training part of seeds 0–2; test images unused). Fig. 7a shows that the best setting was the square crop with lr 10</w:t>
-      </w:r>
-      <w:r>
-        <w:rPr>
-          <w:rFonts w:ascii="Times New Roman" w:cs="Times New Roman" w:eastAsia="Times New Roman" w:hAnsi="Times New Roman"/>
-          <w:sz w:val="20"/>
-          <w:szCs w:val="20"/>
-          <w:vertAlign w:val="superscript"/>
-        </w:rPr>
-        <w:t xml:space="preserve">−3</w:t>
-      </w:r>
-      <w:r>
-        <w:rPr>
-          <w:rFonts w:ascii="Times New Roman" w:cs="Times New Roman" w:eastAsia="Times New Roman" w:hAnsi="Times New Roman"/>
-          <w:sz w:val="20"/>
-          <w:szCs w:val="20"/>
-        </w:rPr>
-        <w:t xml:space="preserve"> and 60 epochs (76.4%); the training accuracy reached 100% in every case after 60 epochs. On the ten test splits it gave 84.889% (std 6.577); the slightly tighter 85% crop gave the 85.556% used above, within run-to-run variation.</w:t>
-      </w:r>
-    </w:p>
-    <w:p>
-      <w:pPr>
-        <w:spacing w:after="70" w:before="0" w:line="240"/>
-        <w:jc w:val="both"/>
-      </w:pPr>
-      <w:r>
-        <w:rPr>
-          <w:rFonts w:ascii="Times New Roman" w:cs="Times New Roman" w:eastAsia="Times New Roman" w:hAnsi="Times New Roman"/>
-          <w:sz w:val="20"/>
-          <w:szCs w:val="20"/>
-        </w:rPr>
-        <w:t xml:space="preserve">A further study tested training-time augmentation (random crop, mirror flip, ±10° rotation, brightness/contrast jitter) with optional dropout (0.3) and weight decay (10</w:t>
-      </w:r>
-      <w:r>
-        <w:rPr>
-          <w:rFonts w:ascii="Times New Roman" w:cs="Times New Roman" w:eastAsia="Times New Roman" w:hAnsi="Times New Roman"/>
-          <w:sz w:val="20"/>
-          <w:szCs w:val="20"/>
-          <w:vertAlign w:val="superscript"/>
-        </w:rPr>
-        <w:t xml:space="preserve">−4</w:t>
-      </w:r>
-      <w:r>
-        <w:rPr>
-          <w:rFonts w:ascii="Times New Roman" w:cs="Times New Roman" w:eastAsia="Times New Roman" w:hAnsi="Times New Roman"/>
-          <w:sz w:val="20"/>
-          <w:szCs w:val="20"/>
-        </w:rPr>
-        <w:t xml:space="preserve">), 80 epochs, validation split as before (mean over seeds 0–2, last three epochs). No augmentation scored best, 77.8%; crop+flip gave 71.8%, full augmentation 69.0% and full augmentation with dropout and weight decay 68.1% (Fig. 7b). The gap between clean training accuracy (97–100%) and validation accuracy grew from 22 to 29 points. Augmentation therefore did not reduce the over-fitting; one possible reason is that the large linear head still memorises the training images, but this was not tested.</w:t>
+        <w:t xml:space="preserve"> Test accuracy of the ten seeds for min–max scaling (red) and Gaussian normalisation (grey) on (a) ORL and (b) Yale (original Yale set-up); thin horizontal lines mark the means.</w:t>
       </w:r>
     </w:p>
     <w:p>
@@ -8472,7 +8358,7 @@
       <w:r>
         <w:drawing>
           <wp:inline distT="0" distB="0" distL="0" distR="0">
-            <wp:extent cx="4572000" cy="1628775"/>
+            <wp:extent cx="4476750" cy="1352550"/>
             <wp:effectExtent t="0" r="0" b="0" l="0"/>
             <wp:docPr id="1" name="" descr="" title=""/>
             <wp:cNvGraphicFramePr>
@@ -8497,6 +8383,191 @@
                   <pic:spPr bwMode="auto">
                     <a:xfrm>
                       <a:off x="0" y="0"/>
+                      <a:ext cx="4476750" cy="1352550"/>
+                    </a:xfrm>
+                    <a:prstGeom prst="rect">
+                      <a:avLst/>
+                    </a:prstGeom>
+                  </pic:spPr>
+                </pic:pic>
+              </a:graphicData>
+            </a:graphic>
+          </wp:inline>
+        </w:drawing>
+      </w:r>
+    </w:p>
+    <w:p>
+      <w:pPr>
+        <w:spacing w:after="90" w:before="20"/>
+        <w:jc w:val="center"/>
+      </w:pPr>
+      <w:r>
+        <w:rPr>
+          <w:rFonts w:ascii="Times New Roman" w:cs="Times New Roman" w:eastAsia="Times New Roman" w:hAnsi="Times New Roman"/>
+          <w:b/>
+          <w:bCs/>
+          <w:sz w:val="18"/>
+          <w:szCs w:val="18"/>
+        </w:rPr>
+        <w:t xml:space="preserve">Fig. 7.</w:t>
+      </w:r>
+      <w:r>
+        <w:rPr>
+          <w:rFonts w:ascii="Times New Roman" w:cs="Times New Roman" w:eastAsia="Times New Roman" w:hAnsi="Times New Roman"/>
+          <w:sz w:val="18"/>
+          <w:szCs w:val="18"/>
+        </w:rPr>
+        <w:t xml:space="preserve"> Distribution of the ten per-seed test accuracies (box = quartiles, dots = seeds; mean ± std at right).</w:t>
+      </w:r>
+    </w:p>
+    <w:p>
+      <w:pPr>
+        <w:keepNext/>
+        <w:spacing w:after="40" w:before="80"/>
+      </w:pPr>
+      <w:r>
+        <w:rPr>
+          <w:rFonts w:ascii="Times New Roman" w:cs="Times New Roman" w:eastAsia="Times New Roman" w:hAnsi="Times New Roman"/>
+          <w:b/>
+          <w:bCs/>
+          <w:i/>
+          <w:iCs/>
+          <w:sz w:val="20"/>
+          <w:szCs w:val="20"/>
+        </w:rPr>
+        <w:t xml:space="preserve">4.3 Yale tuning and augmentation study</w:t>
+      </w:r>
+    </w:p>
+    <w:p>
+      <w:pPr>
+        <w:spacing w:after="70" w:before="0" w:line="240"/>
+        <w:jc w:val="both"/>
+      </w:pPr>
+      <w:r>
+        <w:rPr>
+          <w:rFonts w:ascii="Times New Roman" w:cs="Times New Roman" w:eastAsia="Times New Roman" w:hAnsi="Times New Roman"/>
+          <w:sz w:val="20"/>
+          <w:szCs w:val="20"/>
+        </w:rPr>
+        <w:t xml:space="preserve">Because the original Yale result was low, pre-processing (full-frame resize, centre square crop, tighter 80% crop), learning rate (10</w:t>
+      </w:r>
+      <w:r>
+        <w:rPr>
+          <w:rFonts w:ascii="Times New Roman" w:cs="Times New Roman" w:eastAsia="Times New Roman" w:hAnsi="Times New Roman"/>
+          <w:sz w:val="20"/>
+          <w:szCs w:val="20"/>
+          <w:vertAlign w:val="superscript"/>
+        </w:rPr>
+        <w:t xml:space="preserve">−4</w:t>
+      </w:r>
+      <w:r>
+        <w:rPr>
+          <w:rFonts w:ascii="Times New Roman" w:cs="Times New Roman" w:eastAsia="Times New Roman" w:hAnsi="Times New Roman"/>
+          <w:sz w:val="20"/>
+          <w:szCs w:val="20"/>
+        </w:rPr>
+        <w:t xml:space="preserve"> or 10</w:t>
+      </w:r>
+      <w:r>
+        <w:rPr>
+          <w:rFonts w:ascii="Times New Roman" w:cs="Times New Roman" w:eastAsia="Times New Roman" w:hAnsi="Times New Roman"/>
+          <w:sz w:val="20"/>
+          <w:szCs w:val="20"/>
+          <w:vertAlign w:val="superscript"/>
+        </w:rPr>
+        <w:t xml:space="preserve">−3</w:t>
+      </w:r>
+      <w:r>
+        <w:rPr>
+          <w:rFonts w:ascii="Times New Roman" w:cs="Times New Roman" w:eastAsia="Times New Roman" w:hAnsi="Times New Roman"/>
+          <w:sz w:val="20"/>
+          <w:szCs w:val="20"/>
+        </w:rPr>
+        <w:t xml:space="preserve">) and epochs (30 or 60) were varied on a validation split (96 training / 24 validation images from the training part of seeds 0–2; test images unused). Fig. 8a shows that the best setting was the square crop with lr 10</w:t>
+      </w:r>
+      <w:r>
+        <w:rPr>
+          <w:rFonts w:ascii="Times New Roman" w:cs="Times New Roman" w:eastAsia="Times New Roman" w:hAnsi="Times New Roman"/>
+          <w:sz w:val="20"/>
+          <w:szCs w:val="20"/>
+          <w:vertAlign w:val="superscript"/>
+        </w:rPr>
+        <w:t xml:space="preserve">−3</w:t>
+      </w:r>
+      <w:r>
+        <w:rPr>
+          <w:rFonts w:ascii="Times New Roman" w:cs="Times New Roman" w:eastAsia="Times New Roman" w:hAnsi="Times New Roman"/>
+          <w:sz w:val="20"/>
+          <w:szCs w:val="20"/>
+        </w:rPr>
+        <w:t xml:space="preserve"> and 60 epochs (76.4%); the training accuracy reached 100% in every case after 60 epochs. On the ten test splits it gave 84.889% (std 6.577); the slightly tighter 85% crop gave the 85.556% used above, within run-to-run variation.</w:t>
+      </w:r>
+    </w:p>
+    <w:p>
+      <w:pPr>
+        <w:spacing w:after="70" w:before="0" w:line="240"/>
+        <w:jc w:val="both"/>
+      </w:pPr>
+      <w:r>
+        <w:rPr>
+          <w:rFonts w:ascii="Times New Roman" w:cs="Times New Roman" w:eastAsia="Times New Roman" w:hAnsi="Times New Roman"/>
+          <w:sz w:val="20"/>
+          <w:szCs w:val="20"/>
+        </w:rPr>
+        <w:t xml:space="preserve">A further study tested training-time augmentation (random crop, mirror flip, ±10° rotation, brightness/contrast jitter) with optional dropout (0.3) and weight decay (10</w:t>
+      </w:r>
+      <w:r>
+        <w:rPr>
+          <w:rFonts w:ascii="Times New Roman" w:cs="Times New Roman" w:eastAsia="Times New Roman" w:hAnsi="Times New Roman"/>
+          <w:sz w:val="20"/>
+          <w:szCs w:val="20"/>
+          <w:vertAlign w:val="superscript"/>
+        </w:rPr>
+        <w:t xml:space="preserve">−4</w:t>
+      </w:r>
+      <w:r>
+        <w:rPr>
+          <w:rFonts w:ascii="Times New Roman" w:cs="Times New Roman" w:eastAsia="Times New Roman" w:hAnsi="Times New Roman"/>
+          <w:sz w:val="20"/>
+          <w:szCs w:val="20"/>
+        </w:rPr>
+        <w:t xml:space="preserve">), 80 epochs, validation split as before (mean over seeds 0–2, last three epochs). No augmentation scored best, 77.8%; crop+flip gave 71.8%, full augmentation 69.0% and full augmentation with dropout and weight decay 68.1% (Fig. 8b). The gap between clean training accuracy (97–100%) and validation accuracy grew from 22 to 29 points. Augmentation therefore did not reduce the over-fitting; one possible reason is that the large linear head still memorises the training images, but this was not tested.</w:t>
+      </w:r>
+    </w:p>
+    <w:p>
+      <w:pPr>
+        <w:keepNext/>
+        <w:spacing w:after="0" w:before="20"/>
+        <w:jc w:val="center"/>
+      </w:pPr>
+      <w:r>
+        <w:drawing>
+          <wp:inline distT="0" distB="0" distL="0" distR="0">
+            <wp:extent cx="4572000" cy="1628775"/>
+            <wp:effectExtent t="0" r="0" b="0" l="0"/>
+            <wp:docPr id="1" name="" descr="" title=""/>
+            <wp:cNvGraphicFramePr>
+              <a:graphicFrameLocks xmlns:a="http://schemas.openxmlformats.org/drawingml/2006/main" noChangeAspect="1"/>
+            </wp:cNvGraphicFramePr>
+            <a:graphic xmlns:a="http://schemas.openxmlformats.org/drawingml/2006/main">
+              <a:graphicData uri="http://schemas.openxmlformats.org/drawingml/2006/picture">
+                <pic:pic xmlns:pic="http://schemas.openxmlformats.org/drawingml/2006/picture">
+                  <pic:nvPicPr>
+                    <pic:cNvPr id="0" name="" descr=""/>
+                    <pic:cNvPicPr>
+                      <a:picLocks noChangeAspect="1" noChangeArrowheads="1"/>
+                    </pic:cNvPicPr>
+                  </pic:nvPicPr>
+                  <pic:blipFill>
+                    <a:blip r:embed="rId16" cstate="none"/>
+                    <a:srcRect/>
+                    <a:stretch>
+                      <a:fillRect/>
+                    </a:stretch>
+                  </pic:blipFill>
+                  <pic:spPr bwMode="auto">
+                    <a:xfrm>
+                      <a:off x="0" y="0"/>
                       <a:ext cx="4572000" cy="1628775"/>
                     </a:xfrm>
                     <a:prstGeom prst="rect">
@@ -8523,7 +8594,7 @@
           <w:sz w:val="18"/>
           <w:szCs w:val="18"/>
         </w:rPr>
-        <w:t xml:space="preserve">Fig. 7.</w:t>
+        <w:t xml:space="preserve">Fig. 8.</w:t>
       </w:r>
       <w:r>
         <w:rPr>
@@ -8563,7 +8634,7 @@
           <w:sz w:val="20"/>
           <w:szCs w:val="20"/>
         </w:rPr>
-        <w:t xml:space="preserve">Fig. 8 shows pooled confusion matrices over ten seeds (1,200 ORL and 450 Yale predictions; Yale class </w:t>
+        <w:t xml:space="preserve">Fig. 9 shows pooled confusion matrices over ten seeds (1,200 ORL and 450 Yale predictions; Yale class </w:t>
       </w:r>
       <w:r>
         <w:rPr>
@@ -8639,77 +8710,6 @@
               <w:drawing>
                 <wp:inline distT="0" distB="0" distL="0" distR="0">
                   <wp:extent cx="1828800" cy="1657350"/>
-                  <wp:effectExtent t="0" r="0" b="0" l="0"/>
-                  <wp:docPr id="1" name="" descr="" title=""/>
-                  <wp:cNvGraphicFramePr>
-                    <a:graphicFrameLocks xmlns:a="http://schemas.openxmlformats.org/drawingml/2006/main" noChangeAspect="1"/>
-                  </wp:cNvGraphicFramePr>
-                  <a:graphic xmlns:a="http://schemas.openxmlformats.org/drawingml/2006/main">
-                    <a:graphicData uri="http://schemas.openxmlformats.org/drawingml/2006/picture">
-                      <pic:pic xmlns:pic="http://schemas.openxmlformats.org/drawingml/2006/picture">
-                        <pic:nvPicPr>
-                          <pic:cNvPr id="0" name="" descr=""/>
-                          <pic:cNvPicPr>
-                            <a:picLocks noChangeAspect="1" noChangeArrowheads="1"/>
-                          </pic:cNvPicPr>
-                        </pic:nvPicPr>
-                        <pic:blipFill>
-                          <a:blip r:embed="rId16" cstate="none"/>
-                          <a:srcRect/>
-                          <a:stretch>
-                            <a:fillRect/>
-                          </a:stretch>
-                        </pic:blipFill>
-                        <pic:spPr bwMode="auto">
-                          <a:xfrm>
-                            <a:off x="0" y="0"/>
-                            <a:ext cx="1828800" cy="1657350"/>
-                          </a:xfrm>
-                          <a:prstGeom prst="rect">
-                            <a:avLst/>
-                          </a:prstGeom>
-                        </pic:spPr>
-                      </pic:pic>
-                    </a:graphicData>
-                  </a:graphic>
-                </wp:inline>
-              </w:drawing>
-            </w:r>
-          </w:p>
-          <w:p>
-            <w:pPr>
-              <w:spacing w:after="0"/>
-              <w:jc w:val="center"/>
-            </w:pPr>
-            <w:r>
-              <w:rPr>
-                <w:rFonts w:ascii="Times New Roman" w:cs="Times New Roman" w:eastAsia="Times New Roman" w:hAnsi="Times New Roman"/>
-                <w:sz w:val="18"/>
-                <w:szCs w:val="18"/>
-              </w:rPr>
-              <w:t xml:space="preserve">(a) ORL, mean accuracy 94.67%</w:t>
-            </w:r>
-          </w:p>
-        </w:tc>
-        <w:tc>
-          <w:tcPr>
-            <w:tcW w:type="dxa" w:w="4680"/>
-            <w:tcBorders>
-              <w:top w:val="none"/>
-              <w:left w:val="none"/>
-              <w:bottom w:val="none"/>
-              <w:right w:val="none"/>
-            </w:tcBorders>
-          </w:tcPr>
-          <w:p>
-            <w:pPr>
-              <w:spacing w:after="0"/>
-              <w:jc w:val="center"/>
-            </w:pPr>
-            <w:r>
-              <w:drawing>
-                <wp:inline distT="0" distB="0" distL="0" distR="0">
-                  <wp:extent cx="1828800" cy="1590675"/>
                   <wp:effectExtent t="0" r="0" b="0" l="0"/>
                   <wp:docPr id="1" name="" descr="" title=""/>
                   <wp:cNvGraphicFramePr>
@@ -8734,6 +8734,77 @@
                         <pic:spPr bwMode="auto">
                           <a:xfrm>
                             <a:off x="0" y="0"/>
+                            <a:ext cx="1828800" cy="1657350"/>
+                          </a:xfrm>
+                          <a:prstGeom prst="rect">
+                            <a:avLst/>
+                          </a:prstGeom>
+                        </pic:spPr>
+                      </pic:pic>
+                    </a:graphicData>
+                  </a:graphic>
+                </wp:inline>
+              </w:drawing>
+            </w:r>
+          </w:p>
+          <w:p>
+            <w:pPr>
+              <w:spacing w:after="0"/>
+              <w:jc w:val="center"/>
+            </w:pPr>
+            <w:r>
+              <w:rPr>
+                <w:rFonts w:ascii="Times New Roman" w:cs="Times New Roman" w:eastAsia="Times New Roman" w:hAnsi="Times New Roman"/>
+                <w:sz w:val="18"/>
+                <w:szCs w:val="18"/>
+              </w:rPr>
+              <w:t xml:space="preserve">(a) ORL, mean accuracy 94.67%</w:t>
+            </w:r>
+          </w:p>
+        </w:tc>
+        <w:tc>
+          <w:tcPr>
+            <w:tcW w:type="dxa" w:w="4680"/>
+            <w:tcBorders>
+              <w:top w:val="none"/>
+              <w:left w:val="none"/>
+              <w:bottom w:val="none"/>
+              <w:right w:val="none"/>
+            </w:tcBorders>
+          </w:tcPr>
+          <w:p>
+            <w:pPr>
+              <w:spacing w:after="0"/>
+              <w:jc w:val="center"/>
+            </w:pPr>
+            <w:r>
+              <w:drawing>
+                <wp:inline distT="0" distB="0" distL="0" distR="0">
+                  <wp:extent cx="1828800" cy="1590675"/>
+                  <wp:effectExtent t="0" r="0" b="0" l="0"/>
+                  <wp:docPr id="1" name="" descr="" title=""/>
+                  <wp:cNvGraphicFramePr>
+                    <a:graphicFrameLocks xmlns:a="http://schemas.openxmlformats.org/drawingml/2006/main" noChangeAspect="1"/>
+                  </wp:cNvGraphicFramePr>
+                  <a:graphic xmlns:a="http://schemas.openxmlformats.org/drawingml/2006/main">
+                    <a:graphicData uri="http://schemas.openxmlformats.org/drawingml/2006/picture">
+                      <pic:pic xmlns:pic="http://schemas.openxmlformats.org/drawingml/2006/picture">
+                        <pic:nvPicPr>
+                          <pic:cNvPr id="0" name="" descr=""/>
+                          <pic:cNvPicPr>
+                            <a:picLocks noChangeAspect="1" noChangeArrowheads="1"/>
+                          </pic:cNvPicPr>
+                        </pic:nvPicPr>
+                        <pic:blipFill>
+                          <a:blip r:embed="rId18" cstate="none"/>
+                          <a:srcRect/>
+                          <a:stretch>
+                            <a:fillRect/>
+                          </a:stretch>
+                        </pic:blipFill>
+                        <pic:spPr bwMode="auto">
+                          <a:xfrm>
+                            <a:off x="0" y="0"/>
                             <a:ext cx="1828800" cy="1590675"/>
                           </a:xfrm>
                           <a:prstGeom prst="rect">
@@ -8777,7 +8848,7 @@
           <w:sz w:val="18"/>
           <w:szCs w:val="18"/>
         </w:rPr>
-        <w:t xml:space="preserve">Fig. 8.</w:t>
+        <w:t xml:space="preserve">Fig. 9.</w:t>
       </w:r>
       <w:r>
         <w:rPr>

</xml_diff>

<commit_message>
Remove work-plan section and closing sentence of future scope; enlarge references
Co-Authored-By: Claude Sonnet 5.5 <noreply@anthropic.com>
Claude-Session: https://claude.ai/code/session_01J8wCDpxWDW7SzPHcYaZPKT
</commit_message>
<xml_diff>
--- a/report/QCNN_Mid_updated.docx
+++ b/report/QCNN_Mid_updated.docx
@@ -8934,7 +8934,7 @@
           <w:sz w:val="20"/>
           <w:szCs w:val="20"/>
         </w:rPr>
-        <w:t xml:space="preserve"> (Fig. 4a), reducing 576 patches to 144 or 36 would cut the circuit executions by 4× or 16×, and with a pretrained or fixed front-end only the eight quantum parameters would need shifted runs. An ablation should confirm that the quantum layer still contributes. Other extensions are further quantum layers, pooling and stronger regularisation against the Yale over-fitting.</w:t>
+        <w:t xml:space="preserve"> (Fig. 4a), reducing 576 patches to 144 or 36 would cut the circuit executions by 4× or 16×, and with a pretrained or fixed front-end only the eight quantum parameters would need shifted runs. An ablation should confirm that the quantum layer still contributes.</w:t>
       </w:r>
     </w:p>
     <w:p>
@@ -8950,772 +8950,20 @@
           <w:sz w:val="25"/>
           <w:szCs w:val="25"/>
         </w:rPr>
-        <w:t xml:space="preserve">7. Work Plan and Expected Outcomes</w:t>
-      </w:r>
-    </w:p>
-    <w:p>
-      <w:pPr>
-        <w:keepNext/>
-        <w:spacing w:after="30" w:before="10"/>
-        <w:jc w:val="center"/>
-      </w:pPr>
-      <w:r>
-        <w:rPr>
-          <w:rFonts w:ascii="Times New Roman" w:cs="Times New Roman" w:eastAsia="Times New Roman" w:hAnsi="Times New Roman"/>
-          <w:b/>
-          <w:bCs/>
-          <w:sz w:val="18"/>
-          <w:szCs w:val="18"/>
-        </w:rPr>
-        <w:t xml:space="preserve">Table 3.</w:t>
-      </w:r>
-      <w:r>
-        <w:rPr>
-          <w:rFonts w:ascii="Times New Roman" w:cs="Times New Roman" w:eastAsia="Times New Roman" w:hAnsi="Times New Roman"/>
-          <w:sz w:val="18"/>
-          <w:szCs w:val="18"/>
-        </w:rPr>
-        <w:t xml:space="preserve"> Proposed work plan.</w:t>
-      </w:r>
-    </w:p>
-    <w:tbl>
-      <w:tblPr>
-        <w:tblW w:type="dxa" w:w="9360"/>
-        <w:jc w:val="center"/>
-        <w:tblBorders>
-          <w:top w:val="single" w:color="auto" w:sz="4"/>
-          <w:left w:val="single" w:color="auto" w:sz="4"/>
-          <w:bottom w:val="single" w:color="auto" w:sz="4"/>
-          <w:right w:val="single" w:color="auto" w:sz="4"/>
-          <w:insideH w:val="single" w:color="auto" w:sz="4"/>
-          <w:insideV w:val="single" w:color="auto" w:sz="4"/>
-        </w:tblBorders>
-      </w:tblPr>
-      <w:tblGrid>
-        <w:gridCol w:w="700"/>
-        <w:gridCol w:w="1500"/>
-        <w:gridCol w:w="7160"/>
-      </w:tblGrid>
-      <w:tr>
-        <w:trPr>
-          <w:cantSplit/>
-          <w:tblHeader/>
-        </w:trPr>
-        <w:tc>
-          <w:tcPr>
-            <w:tcW w:type="dxa" w:w="700"/>
-            <w:tcBorders>
-              <w:top w:val="single" w:color="999999" w:sz="4"/>
-              <w:left w:val="single" w:color="999999" w:sz="4"/>
-              <w:bottom w:val="single" w:color="999999" w:sz="4"/>
-              <w:right w:val="single" w:color="999999" w:sz="4"/>
-            </w:tcBorders>
-            <w:shd w:fill="E7EAF0" w:color="auto" w:val="clear"/>
-            <w:tcMar>
-              <w:top w:type="dxa" w:w="25"/>
-              <w:left w:type="dxa" w:w="70"/>
-              <w:bottom w:type="dxa" w:w="25"/>
-              <w:right w:type="dxa" w:w="70"/>
-            </w:tcMar>
-            <w:vAlign w:val="center"/>
-          </w:tcPr>
-          <w:p>
-            <w:pPr>
-              <w:keepNext/>
-              <w:spacing w:after="0"/>
-              <w:jc w:val="left"/>
-            </w:pPr>
-            <w:r>
-              <w:rPr>
-                <w:rFonts w:ascii="Times New Roman" w:cs="Times New Roman" w:eastAsia="Times New Roman" w:hAnsi="Times New Roman"/>
-                <w:b/>
-                <w:bCs/>
-                <w:sz w:val="18"/>
-                <w:szCs w:val="18"/>
-              </w:rPr>
-              <w:t xml:space="preserve">Phase</w:t>
-            </w:r>
-          </w:p>
-        </w:tc>
-        <w:tc>
-          <w:tcPr>
-            <w:tcW w:type="dxa" w:w="1500"/>
-            <w:tcBorders>
-              <w:top w:val="single" w:color="999999" w:sz="4"/>
-              <w:left w:val="single" w:color="999999" w:sz="4"/>
-              <w:bottom w:val="single" w:color="999999" w:sz="4"/>
-              <w:right w:val="single" w:color="999999" w:sz="4"/>
-            </w:tcBorders>
-            <w:shd w:fill="E7EAF0" w:color="auto" w:val="clear"/>
-            <w:tcMar>
-              <w:top w:type="dxa" w:w="25"/>
-              <w:left w:type="dxa" w:w="70"/>
-              <w:bottom w:type="dxa" w:w="25"/>
-              <w:right w:type="dxa" w:w="70"/>
-            </w:tcMar>
-            <w:vAlign w:val="center"/>
-          </w:tcPr>
-          <w:p>
-            <w:pPr>
-              <w:keepNext/>
-              <w:spacing w:after="0"/>
-              <w:jc w:val="center"/>
-            </w:pPr>
-            <w:r>
-              <w:rPr>
-                <w:rFonts w:ascii="Times New Roman" w:cs="Times New Roman" w:eastAsia="Times New Roman" w:hAnsi="Times New Roman"/>
-                <w:b/>
-                <w:bCs/>
-                <w:sz w:val="18"/>
-                <w:szCs w:val="18"/>
-              </w:rPr>
-              <w:t xml:space="preserve">Period</w:t>
-            </w:r>
-          </w:p>
-        </w:tc>
-        <w:tc>
-          <w:tcPr>
-            <w:tcW w:type="dxa" w:w="7160"/>
-            <w:tcBorders>
-              <w:top w:val="single" w:color="999999" w:sz="4"/>
-              <w:left w:val="single" w:color="999999" w:sz="4"/>
-              <w:bottom w:val="single" w:color="999999" w:sz="4"/>
-              <w:right w:val="single" w:color="999999" w:sz="4"/>
-            </w:tcBorders>
-            <w:shd w:fill="E7EAF0" w:color="auto" w:val="clear"/>
-            <w:tcMar>
-              <w:top w:type="dxa" w:w="25"/>
-              <w:left w:type="dxa" w:w="70"/>
-              <w:bottom w:type="dxa" w:w="25"/>
-              <w:right w:type="dxa" w:w="70"/>
-            </w:tcMar>
-            <w:vAlign w:val="center"/>
-          </w:tcPr>
-          <w:p>
-            <w:pPr>
-              <w:keepNext/>
-              <w:spacing w:after="0"/>
-              <w:jc w:val="center"/>
-            </w:pPr>
-            <w:r>
-              <w:rPr>
-                <w:rFonts w:ascii="Times New Roman" w:cs="Times New Roman" w:eastAsia="Times New Roman" w:hAnsi="Times New Roman"/>
-                <w:b/>
-                <w:bCs/>
-                <w:sz w:val="18"/>
-                <w:szCs w:val="18"/>
-              </w:rPr>
-              <w:t xml:space="preserve">Planned work</w:t>
-            </w:r>
-          </w:p>
-        </w:tc>
-      </w:tr>
-      <w:tr>
-        <w:trPr>
-          <w:cantSplit/>
-          <w:tblHeader w:val="false"/>
-        </w:trPr>
-        <w:tc>
-          <w:tcPr>
-            <w:tcW w:type="dxa" w:w="700"/>
-            <w:tcBorders>
-              <w:top w:val="single" w:color="999999" w:sz="4"/>
-              <w:left w:val="single" w:color="999999" w:sz="4"/>
-              <w:bottom w:val="single" w:color="999999" w:sz="4"/>
-              <w:right w:val="single" w:color="999999" w:sz="4"/>
-            </w:tcBorders>
-            <w:tcMar>
-              <w:top w:type="dxa" w:w="25"/>
-              <w:left w:type="dxa" w:w="70"/>
-              <w:bottom w:type="dxa" w:w="25"/>
-              <w:right w:type="dxa" w:w="70"/>
-            </w:tcMar>
-            <w:vAlign w:val="center"/>
-          </w:tcPr>
-          <w:p>
-            <w:pPr>
-              <w:keepNext/>
-              <w:spacing w:after="0"/>
-              <w:jc w:val="left"/>
-            </w:pPr>
-            <w:r>
-              <w:rPr>
-                <w:rFonts w:ascii="Times New Roman" w:cs="Times New Roman" w:eastAsia="Times New Roman" w:hAnsi="Times New Roman"/>
-                <w:b w:val="false"/>
-                <w:bCs w:val="false"/>
-                <w:sz w:val="18"/>
-                <w:szCs w:val="18"/>
-              </w:rPr>
-              <w:t xml:space="preserve">1</w:t>
-            </w:r>
-          </w:p>
-        </w:tc>
-        <w:tc>
-          <w:tcPr>
-            <w:tcW w:type="dxa" w:w="1500"/>
-            <w:tcBorders>
-              <w:top w:val="single" w:color="999999" w:sz="4"/>
-              <w:left w:val="single" w:color="999999" w:sz="4"/>
-              <w:bottom w:val="single" w:color="999999" w:sz="4"/>
-              <w:right w:val="single" w:color="999999" w:sz="4"/>
-            </w:tcBorders>
-            <w:tcMar>
-              <w:top w:type="dxa" w:w="25"/>
-              <w:left w:type="dxa" w:w="70"/>
-              <w:bottom w:type="dxa" w:w="25"/>
-              <w:right w:type="dxa" w:w="70"/>
-            </w:tcMar>
-            <w:vAlign w:val="center"/>
-          </w:tcPr>
-          <w:p>
-            <w:pPr>
-              <w:keepNext/>
-              <w:spacing w:after="0"/>
-              <w:jc w:val="center"/>
-            </w:pPr>
-            <w:r>
-              <w:rPr>
-                <w:rFonts w:ascii="Times New Roman" w:cs="Times New Roman" w:eastAsia="Times New Roman" w:hAnsi="Times New Roman"/>
-                <w:b w:val="false"/>
-                <w:bCs w:val="false"/>
-                <w:sz w:val="18"/>
-                <w:szCs w:val="18"/>
-              </w:rPr>
-              <w:t xml:space="preserve">Oct–Nov 2026</w:t>
-            </w:r>
-          </w:p>
-        </w:tc>
-        <w:tc>
-          <w:tcPr>
-            <w:tcW w:type="dxa" w:w="7160"/>
-            <w:tcBorders>
-              <w:top w:val="single" w:color="999999" w:sz="4"/>
-              <w:left w:val="single" w:color="999999" w:sz="4"/>
-              <w:bottom w:val="single" w:color="999999" w:sz="4"/>
-              <w:right w:val="single" w:color="999999" w:sz="4"/>
-            </w:tcBorders>
-            <w:tcMar>
-              <w:top w:type="dxa" w:w="25"/>
-              <w:left w:type="dxa" w:w="70"/>
-              <w:bottom w:type="dxa" w:w="25"/>
-              <w:right w:type="dxa" w:w="70"/>
-            </w:tcMar>
-            <w:vAlign w:val="center"/>
-          </w:tcPr>
-          <w:p>
-            <w:pPr>
-              <w:keepNext/>
-              <w:spacing w:after="0"/>
-              <w:jc w:val="center"/>
-            </w:pPr>
-            <w:r>
-              <w:rPr>
-                <w:rFonts w:ascii="Times New Roman" w:cs="Times New Roman" w:eastAsia="Times New Roman" w:hAnsi="Times New Roman"/>
-                <w:b w:val="false"/>
-                <w:bCs w:val="false"/>
-                <w:sz w:val="18"/>
-                <w:szCs w:val="18"/>
-              </w:rPr>
-              <w:t xml:space="preserve">Yale over-fitting study (regularisation, split details); test loss, precision, recall and F1-score for both datasets.</w:t>
-            </w:r>
-          </w:p>
-        </w:tc>
-      </w:tr>
-      <w:tr>
-        <w:trPr>
-          <w:cantSplit/>
-          <w:tblHeader w:val="false"/>
-        </w:trPr>
-        <w:tc>
-          <w:tcPr>
-            <w:tcW w:type="dxa" w:w="700"/>
-            <w:tcBorders>
-              <w:top w:val="single" w:color="999999" w:sz="4"/>
-              <w:left w:val="single" w:color="999999" w:sz="4"/>
-              <w:bottom w:val="single" w:color="999999" w:sz="4"/>
-              <w:right w:val="single" w:color="999999" w:sz="4"/>
-            </w:tcBorders>
-            <w:tcMar>
-              <w:top w:type="dxa" w:w="25"/>
-              <w:left w:type="dxa" w:w="70"/>
-              <w:bottom w:type="dxa" w:w="25"/>
-              <w:right w:type="dxa" w:w="70"/>
-            </w:tcMar>
-            <w:vAlign w:val="center"/>
-          </w:tcPr>
-          <w:p>
-            <w:pPr>
-              <w:keepNext/>
-              <w:spacing w:after="0"/>
-              <w:jc w:val="left"/>
-            </w:pPr>
-            <w:r>
-              <w:rPr>
-                <w:rFonts w:ascii="Times New Roman" w:cs="Times New Roman" w:eastAsia="Times New Roman" w:hAnsi="Times New Roman"/>
-                <w:b w:val="false"/>
-                <w:bCs w:val="false"/>
-                <w:sz w:val="18"/>
-                <w:szCs w:val="18"/>
-              </w:rPr>
-              <w:t xml:space="preserve">2</w:t>
-            </w:r>
-          </w:p>
-        </w:tc>
-        <w:tc>
-          <w:tcPr>
-            <w:tcW w:type="dxa" w:w="1500"/>
-            <w:tcBorders>
-              <w:top w:val="single" w:color="999999" w:sz="4"/>
-              <w:left w:val="single" w:color="999999" w:sz="4"/>
-              <w:bottom w:val="single" w:color="999999" w:sz="4"/>
-              <w:right w:val="single" w:color="999999" w:sz="4"/>
-            </w:tcBorders>
-            <w:tcMar>
-              <w:top w:type="dxa" w:w="25"/>
-              <w:left w:type="dxa" w:w="70"/>
-              <w:bottom w:type="dxa" w:w="25"/>
-              <w:right w:type="dxa" w:w="70"/>
-            </w:tcMar>
-            <w:vAlign w:val="center"/>
-          </w:tcPr>
-          <w:p>
-            <w:pPr>
-              <w:keepNext/>
-              <w:spacing w:after="0"/>
-              <w:jc w:val="center"/>
-            </w:pPr>
-            <w:r>
-              <w:rPr>
-                <w:rFonts w:ascii="Times New Roman" w:cs="Times New Roman" w:eastAsia="Times New Roman" w:hAnsi="Times New Roman"/>
-                <w:b w:val="false"/>
-                <w:bCs w:val="false"/>
-                <w:sz w:val="18"/>
-                <w:szCs w:val="18"/>
-              </w:rPr>
-              <w:t xml:space="preserve">Nov–Dec 2026</w:t>
-            </w:r>
-          </w:p>
-        </w:tc>
-        <w:tc>
-          <w:tcPr>
-            <w:tcW w:type="dxa" w:w="7160"/>
-            <w:tcBorders>
-              <w:top w:val="single" w:color="999999" w:sz="4"/>
-              <w:left w:val="single" w:color="999999" w:sz="4"/>
-              <w:bottom w:val="single" w:color="999999" w:sz="4"/>
-              <w:right w:val="single" w:color="999999" w:sz="4"/>
-            </w:tcBorders>
-            <w:tcMar>
-              <w:top w:type="dxa" w:w="25"/>
-              <w:left w:type="dxa" w:w="70"/>
-              <w:bottom w:type="dxa" w:w="25"/>
-              <w:right w:type="dxa" w:w="70"/>
-            </w:tcMar>
-            <w:vAlign w:val="center"/>
-          </w:tcPr>
-          <w:p>
-            <w:pPr>
-              <w:keepNext/>
-              <w:spacing w:after="0"/>
-              <w:jc w:val="center"/>
-            </w:pPr>
-            <w:r>
-              <w:rPr>
-                <w:rFonts w:ascii="Times New Roman" w:cs="Times New Roman" w:eastAsia="Times New Roman" w:hAnsi="Times New Roman"/>
-                <w:b w:val="false"/>
-                <w:bCs w:val="false"/>
-                <w:sz w:val="18"/>
-                <w:szCs w:val="18"/>
-              </w:rPr>
-              <w:t xml:space="preserve">Ablations (without R</w:t>
-            </w:r>
-            <w:r>
-              <w:rPr>
-                <w:rFonts w:ascii="Times New Roman" w:cs="Times New Roman" w:eastAsia="Times New Roman" w:hAnsi="Times New Roman"/>
-                <w:b w:val="false"/>
-                <w:bCs w:val="false"/>
-                <w:sz w:val="18"/>
-                <w:szCs w:val="18"/>
-                <w:vertAlign w:val="subscript"/>
-              </w:rPr>
-              <w:t xml:space="preserve">X</w:t>
-            </w:r>
-            <w:r>
-              <w:rPr>
-                <w:rFonts w:ascii="Times New Roman" w:cs="Times New Roman" w:eastAsia="Times New Roman" w:hAnsi="Times New Roman"/>
-                <w:b w:val="false"/>
-                <w:bCs w:val="false"/>
-                <w:sz w:val="18"/>
-                <w:szCs w:val="18"/>
-              </w:rPr>
-              <w:t xml:space="preserve">, without R</w:t>
-            </w:r>
-            <w:r>
-              <w:rPr>
-                <w:rFonts w:ascii="Times New Roman" w:cs="Times New Roman" w:eastAsia="Times New Roman" w:hAnsi="Times New Roman"/>
-                <w:b w:val="false"/>
-                <w:bCs w:val="false"/>
-                <w:sz w:val="18"/>
-                <w:szCs w:val="18"/>
-                <w:vertAlign w:val="subscript"/>
-              </w:rPr>
-              <w:t xml:space="preserve">Z</w:t>
-            </w:r>
-            <w:r>
-              <w:rPr>
-                <w:rFonts w:ascii="Times New Roman" w:cs="Times New Roman" w:eastAsia="Times New Roman" w:hAnsi="Times New Roman"/>
-                <w:b w:val="false"/>
-                <w:bCs w:val="false"/>
-                <w:sz w:val="18"/>
-                <w:szCs w:val="18"/>
-              </w:rPr>
-              <w:t xml:space="preserve">, without entanglement, 3×3 kernel) and the single-measurement variant, ten seeds, both datasets; end-semester report.</w:t>
-            </w:r>
-          </w:p>
-        </w:tc>
-      </w:tr>
-      <w:tr>
-        <w:trPr>
-          <w:cantSplit/>
-          <w:tblHeader w:val="false"/>
-        </w:trPr>
-        <w:tc>
-          <w:tcPr>
-            <w:tcW w:type="dxa" w:w="700"/>
-            <w:tcBorders>
-              <w:top w:val="single" w:color="999999" w:sz="4"/>
-              <w:left w:val="single" w:color="999999" w:sz="4"/>
-              <w:bottom w:val="single" w:color="999999" w:sz="4"/>
-              <w:right w:val="single" w:color="999999" w:sz="4"/>
-            </w:tcBorders>
-            <w:tcMar>
-              <w:top w:type="dxa" w:w="25"/>
-              <w:left w:type="dxa" w:w="70"/>
-              <w:bottom w:type="dxa" w:w="25"/>
-              <w:right w:type="dxa" w:w="70"/>
-            </w:tcMar>
-            <w:vAlign w:val="center"/>
-          </w:tcPr>
-          <w:p>
-            <w:pPr>
-              <w:keepNext/>
-              <w:spacing w:after="0"/>
-              <w:jc w:val="left"/>
-            </w:pPr>
-            <w:r>
-              <w:rPr>
-                <w:rFonts w:ascii="Times New Roman" w:cs="Times New Roman" w:eastAsia="Times New Roman" w:hAnsi="Times New Roman"/>
-                <w:b w:val="false"/>
-                <w:bCs w:val="false"/>
-                <w:sz w:val="18"/>
-                <w:szCs w:val="18"/>
-              </w:rPr>
-              <w:t xml:space="preserve">3</w:t>
-            </w:r>
-          </w:p>
-        </w:tc>
-        <w:tc>
-          <w:tcPr>
-            <w:tcW w:type="dxa" w:w="1500"/>
-            <w:tcBorders>
-              <w:top w:val="single" w:color="999999" w:sz="4"/>
-              <w:left w:val="single" w:color="999999" w:sz="4"/>
-              <w:bottom w:val="single" w:color="999999" w:sz="4"/>
-              <w:right w:val="single" w:color="999999" w:sz="4"/>
-            </w:tcBorders>
-            <w:tcMar>
-              <w:top w:type="dxa" w:w="25"/>
-              <w:left w:type="dxa" w:w="70"/>
-              <w:bottom w:type="dxa" w:w="25"/>
-              <w:right w:type="dxa" w:w="70"/>
-            </w:tcMar>
-            <w:vAlign w:val="center"/>
-          </w:tcPr>
-          <w:p>
-            <w:pPr>
-              <w:keepNext/>
-              <w:spacing w:after="0"/>
-              <w:jc w:val="center"/>
-            </w:pPr>
-            <w:r>
-              <w:rPr>
-                <w:rFonts w:ascii="Times New Roman" w:cs="Times New Roman" w:eastAsia="Times New Roman" w:hAnsi="Times New Roman"/>
-                <w:b w:val="false"/>
-                <w:bCs w:val="false"/>
-                <w:sz w:val="18"/>
-                <w:szCs w:val="18"/>
-              </w:rPr>
-              <w:t xml:space="preserve">Jan–Feb 2027</w:t>
-            </w:r>
-          </w:p>
-        </w:tc>
-        <w:tc>
-          <w:tcPr>
-            <w:tcW w:type="dxa" w:w="7160"/>
-            <w:tcBorders>
-              <w:top w:val="single" w:color="999999" w:sz="4"/>
-              <w:left w:val="single" w:color="999999" w:sz="4"/>
-              <w:bottom w:val="single" w:color="999999" w:sz="4"/>
-              <w:right w:val="single" w:color="999999" w:sz="4"/>
-            </w:tcBorders>
-            <w:tcMar>
-              <w:top w:type="dxa" w:w="25"/>
-              <w:left w:type="dxa" w:w="70"/>
-              <w:bottom w:type="dxa" w:w="25"/>
-              <w:right w:type="dxa" w:w="70"/>
-            </w:tcMar>
-            <w:vAlign w:val="center"/>
-          </w:tcPr>
-          <w:p>
-            <w:pPr>
-              <w:keepNext/>
-              <w:spacing w:after="0"/>
-              <w:jc w:val="center"/>
-            </w:pPr>
-            <w:r>
-              <w:rPr>
-                <w:rFonts w:ascii="Times New Roman" w:cs="Times New Roman" w:eastAsia="Times New Roman" w:hAnsi="Times New Roman"/>
-                <w:b w:val="false"/>
-                <w:bCs w:val="false"/>
-                <w:sz w:val="18"/>
-                <w:szCs w:val="18"/>
-              </w:rPr>
-              <w:t xml:space="preserve">Finite-shot sweeps, noisy-simulator experiments (depolarising, read-out), parameter-shift training on a small subset, trained filter on a cloud backend if access allows; feature-extraction front-end.</w:t>
-            </w:r>
-          </w:p>
-        </w:tc>
-      </w:tr>
-      <w:tr>
-        <w:trPr>
-          <w:cantSplit/>
-          <w:tblHeader w:val="false"/>
-        </w:trPr>
-        <w:tc>
-          <w:tcPr>
-            <w:tcW w:type="dxa" w:w="700"/>
-            <w:tcBorders>
-              <w:top w:val="single" w:color="999999" w:sz="4"/>
-              <w:left w:val="single" w:color="999999" w:sz="4"/>
-              <w:bottom w:val="single" w:color="999999" w:sz="4"/>
-              <w:right w:val="single" w:color="999999" w:sz="4"/>
-            </w:tcBorders>
-            <w:tcMar>
-              <w:top w:type="dxa" w:w="25"/>
-              <w:left w:type="dxa" w:w="70"/>
-              <w:bottom w:type="dxa" w:w="25"/>
-              <w:right w:type="dxa" w:w="70"/>
-            </w:tcMar>
-            <w:vAlign w:val="center"/>
-          </w:tcPr>
-          <w:p>
-            <w:pPr>
-              <w:keepNext w:val="false"/>
-              <w:spacing w:after="0"/>
-              <w:jc w:val="left"/>
-            </w:pPr>
-            <w:r>
-              <w:rPr>
-                <w:rFonts w:ascii="Times New Roman" w:cs="Times New Roman" w:eastAsia="Times New Roman" w:hAnsi="Times New Roman"/>
-                <w:b w:val="false"/>
-                <w:bCs w:val="false"/>
-                <w:sz w:val="18"/>
-                <w:szCs w:val="18"/>
-              </w:rPr>
-              <w:t xml:space="preserve">4</w:t>
-            </w:r>
-          </w:p>
-        </w:tc>
-        <w:tc>
-          <w:tcPr>
-            <w:tcW w:type="dxa" w:w="1500"/>
-            <w:tcBorders>
-              <w:top w:val="single" w:color="999999" w:sz="4"/>
-              <w:left w:val="single" w:color="999999" w:sz="4"/>
-              <w:bottom w:val="single" w:color="999999" w:sz="4"/>
-              <w:right w:val="single" w:color="999999" w:sz="4"/>
-            </w:tcBorders>
-            <w:tcMar>
-              <w:top w:type="dxa" w:w="25"/>
-              <w:left w:type="dxa" w:w="70"/>
-              <w:bottom w:type="dxa" w:w="25"/>
-              <w:right w:type="dxa" w:w="70"/>
-            </w:tcMar>
-            <w:vAlign w:val="center"/>
-          </w:tcPr>
-          <w:p>
-            <w:pPr>
-              <w:keepNext w:val="false"/>
-              <w:spacing w:after="0"/>
-              <w:jc w:val="center"/>
-            </w:pPr>
-            <w:r>
-              <w:rPr>
-                <w:rFonts w:ascii="Times New Roman" w:cs="Times New Roman" w:eastAsia="Times New Roman" w:hAnsi="Times New Roman"/>
-                <w:b w:val="false"/>
-                <w:bCs w:val="false"/>
-                <w:sz w:val="18"/>
-                <w:szCs w:val="18"/>
-              </w:rPr>
-              <w:t xml:space="preserve">Mar–Apr 2027</w:t>
-            </w:r>
-          </w:p>
-        </w:tc>
-        <w:tc>
-          <w:tcPr>
-            <w:tcW w:type="dxa" w:w="7160"/>
-            <w:tcBorders>
-              <w:top w:val="single" w:color="999999" w:sz="4"/>
-              <w:left w:val="single" w:color="999999" w:sz="4"/>
-              <w:bottom w:val="single" w:color="999999" w:sz="4"/>
-              <w:right w:val="single" w:color="999999" w:sz="4"/>
-            </w:tcBorders>
-            <w:tcMar>
-              <w:top w:type="dxa" w:w="25"/>
-              <w:left w:type="dxa" w:w="70"/>
-              <w:bottom w:type="dxa" w:w="25"/>
-              <w:right w:type="dxa" w:w="70"/>
-            </w:tcMar>
-            <w:vAlign w:val="center"/>
-          </w:tcPr>
-          <w:p>
-            <w:pPr>
-              <w:keepNext w:val="false"/>
-              <w:spacing w:after="0"/>
-              <w:jc w:val="center"/>
-            </w:pPr>
-            <w:r>
-              <w:rPr>
-                <w:rFonts w:ascii="Times New Roman" w:cs="Times New Roman" w:eastAsia="Times New Roman" w:hAnsi="Times New Roman"/>
-                <w:b w:val="false"/>
-                <w:bCs w:val="false"/>
-                <w:sz w:val="18"/>
-                <w:szCs w:val="18"/>
-              </w:rPr>
-              <w:t xml:space="preserve">Final evaluation, code documentation, final thesis, paper draft and presentation.</w:t>
-            </w:r>
-          </w:p>
-        </w:tc>
-      </w:tr>
-    </w:tbl>
-    <w:p>
-      <w:pPr>
-        <w:spacing w:after="70" w:before="70" w:line="240"/>
+        <w:t xml:space="preserve">References</w:t>
+      </w:r>
+    </w:p>
+    <w:p>
+      <w:pPr>
+        <w:spacing w:after="15" w:line="235"/>
+        <w:ind w:left="520" w:hanging="520"/>
         <w:jc w:val="both"/>
       </w:pPr>
       <w:r>
         <w:rPr>
           <w:rFonts w:ascii="Times New Roman" w:cs="Times New Roman" w:eastAsia="Times New Roman" w:hAnsi="Times New Roman"/>
-          <w:b/>
-          <w:bCs/>
-          <w:sz w:val="20"/>
-          <w:szCs w:val="20"/>
-        </w:rPr>
-        <w:t xml:space="preserve">Expected outcomes.</w:t>
-      </w:r>
-      <w:r>
-        <w:rPr>
-          <w:rFonts w:ascii="Times New Roman" w:cs="Times New Roman" w:eastAsia="Times New Roman" w:hAnsi="Times New Roman"/>
-          <w:sz w:val="20"/>
-          <w:szCs w:val="20"/>
-        </w:rPr>
-        <w:t xml:space="preserve"> (1) A verified, documented MG-QCNN implementation with an analytical description of its filter. (2) A statistically sound evaluation over ten splits. (3) Ablations of the R</w:t>
-      </w:r>
-      <w:r>
-        <w:rPr>
-          <w:rFonts w:ascii="Times New Roman" w:cs="Times New Roman" w:eastAsia="Times New Roman" w:hAnsi="Times New Roman"/>
-          <w:sz w:val="20"/>
-          <w:szCs w:val="20"/>
-          <w:vertAlign w:val="subscript"/>
-        </w:rPr>
-        <w:t xml:space="preserve">X</w:t>
-      </w:r>
-      <w:r>
-        <w:rPr>
-          <w:rFonts w:ascii="Times New Roman" w:cs="Times New Roman" w:eastAsia="Times New Roman" w:hAnsi="Times New Roman"/>
-          <w:sz w:val="20"/>
-          <w:szCs w:val="20"/>
-        </w:rPr>
-        <w:t xml:space="preserve"> and R</w:t>
-      </w:r>
-      <w:r>
-        <w:rPr>
-          <w:rFonts w:ascii="Times New Roman" w:cs="Times New Roman" w:eastAsia="Times New Roman" w:hAnsi="Times New Roman"/>
-          <w:sz w:val="20"/>
-          <w:szCs w:val="20"/>
-          <w:vertAlign w:val="subscript"/>
-        </w:rPr>
-        <w:t xml:space="preserve">Z</w:t>
-      </w:r>
-      <w:r>
-        <w:rPr>
-          <w:rFonts w:ascii="Times New Roman" w:cs="Times New Roman" w:eastAsia="Times New Roman" w:hAnsi="Times New Roman"/>
-          <w:sz w:val="20"/>
-          <w:szCs w:val="20"/>
-        </w:rPr>
-        <w:t xml:space="preserve"> rotations, entanglement and kernel size; the reference work reports ORL mean accuracies of 95.959% (full model), 92.917% (3×3 filter), 90.333% (no R</w:t>
-      </w:r>
-      <w:r>
-        <w:rPr>
-          <w:rFonts w:ascii="Times New Roman" w:cs="Times New Roman" w:eastAsia="Times New Roman" w:hAnsi="Times New Roman"/>
-          <w:sz w:val="20"/>
-          <w:szCs w:val="20"/>
-          <w:vertAlign w:val="subscript"/>
-        </w:rPr>
-        <w:t xml:space="preserve">Z</w:t>
-      </w:r>
-      <w:r>
-        <w:rPr>
-          <w:rFonts w:ascii="Times New Roman" w:cs="Times New Roman" w:eastAsia="Times New Roman" w:hAnsi="Times New Roman"/>
-          <w:sz w:val="20"/>
-          <w:szCs w:val="20"/>
-        </w:rPr>
-        <w:t xml:space="preserve">), 89.333% (no R</w:t>
-      </w:r>
-      <w:r>
-        <w:rPr>
-          <w:rFonts w:ascii="Times New Roman" w:cs="Times New Roman" w:eastAsia="Times New Roman" w:hAnsi="Times New Roman"/>
-          <w:sz w:val="20"/>
-          <w:szCs w:val="20"/>
-          <w:vertAlign w:val="subscript"/>
-        </w:rPr>
-        <w:t xml:space="preserve">X</w:t>
-      </w:r>
-      <w:r>
-        <w:rPr>
-          <w:rFonts w:ascii="Times New Roman" w:cs="Times New Roman" w:eastAsia="Times New Roman" w:hAnsi="Times New Roman"/>
-          <w:sz w:val="20"/>
-          <w:szCs w:val="20"/>
-        </w:rPr>
-        <w:t xml:space="preserve">) and 88.417% (no entanglement), which will serve as verification targets. (4) A study of finite shots and hardware-like noise, and a test on a noisy or real backend, which [4] leaves open. (5) A reduced-cost design via feature extraction, and a final thesis and paper-ready report.</w:t>
-      </w:r>
-    </w:p>
-    <w:p>
-      <w:pPr>
-        <w:keepNext/>
-        <w:spacing w:after="60" w:before="140"/>
-      </w:pPr>
-      <w:r>
-        <w:rPr>
-          <w:rFonts w:ascii="Times New Roman" w:cs="Times New Roman" w:eastAsia="Times New Roman" w:hAnsi="Times New Roman"/>
-          <w:b/>
-          <w:bCs/>
-          <w:sz w:val="25"/>
-          <w:szCs w:val="25"/>
-        </w:rPr>
-        <w:t xml:space="preserve">References</w:t>
-      </w:r>
-    </w:p>
-    <w:p>
-      <w:pPr>
-        <w:spacing w:after="10" w:line="220"/>
-        <w:ind w:left="420" w:hanging="420"/>
-        <w:jc w:val="both"/>
-      </w:pPr>
-      <w:r>
-        <w:rPr>
-          <w:rFonts w:ascii="Times New Roman" w:cs="Times New Roman" w:eastAsia="Times New Roman" w:hAnsi="Times New Roman"/>
-          <w:sz w:val="16"/>
-          <w:szCs w:val="16"/>
+          <w:sz w:val="20"/>
+          <w:szCs w:val="20"/>
         </w:rPr>
         <w:t xml:space="preserve">[1]	M. Wang and W. Deng, “Deep face recognition: A survey,” </w:t>
       </w:r>
@@ -9724,46 +8972,46 @@
           <w:rFonts w:ascii="Times New Roman" w:cs="Times New Roman" w:eastAsia="Times New Roman" w:hAnsi="Times New Roman"/>
           <w:i/>
           <w:iCs/>
-          <w:sz w:val="16"/>
-          <w:szCs w:val="16"/>
+          <w:sz w:val="20"/>
+          <w:szCs w:val="20"/>
         </w:rPr>
         <w:t xml:space="preserve">Neurocomputing</w:t>
       </w:r>
       <w:r>
         <w:rPr>
           <w:rFonts w:ascii="Times New Roman" w:cs="Times New Roman" w:eastAsia="Times New Roman" w:hAnsi="Times New Roman"/>
-          <w:sz w:val="16"/>
-          <w:szCs w:val="16"/>
+          <w:sz w:val="20"/>
+          <w:szCs w:val="20"/>
         </w:rPr>
         <w:t xml:space="preserve">, vol. 429, pp. 215–244, Mar. 2021.</w:t>
       </w:r>
     </w:p>
     <w:p>
       <w:pPr>
-        <w:spacing w:after="10" w:line="220"/>
-        <w:ind w:left="420" w:hanging="420"/>
+        <w:spacing w:after="15" w:line="235"/>
+        <w:ind w:left="520" w:hanging="520"/>
         <w:jc w:val="both"/>
       </w:pPr>
       <w:r>
         <w:rPr>
           <w:rFonts w:ascii="Times New Roman" w:cs="Times New Roman" w:eastAsia="Times New Roman" w:hAnsi="Times New Roman"/>
-          <w:sz w:val="16"/>
-          <w:szCs w:val="16"/>
+          <w:sz w:val="20"/>
+          <w:szCs w:val="20"/>
         </w:rPr>
         <w:t xml:space="preserve">[2]	N. C. Thompson, K. Greenewald, K. Lee, and G. F. Manso, “The computational limits of deep learning,” arXiv:2007.05558, 2020.</w:t>
       </w:r>
     </w:p>
     <w:p>
       <w:pPr>
-        <w:spacing w:after="10" w:line="220"/>
-        <w:ind w:left="420" w:hanging="420"/>
+        <w:spacing w:after="15" w:line="235"/>
+        <w:ind w:left="520" w:hanging="520"/>
         <w:jc w:val="both"/>
       </w:pPr>
       <w:r>
         <w:rPr>
           <w:rFonts w:ascii="Times New Roman" w:cs="Times New Roman" w:eastAsia="Times New Roman" w:hAnsi="Times New Roman"/>
-          <w:sz w:val="16"/>
-          <w:szCs w:val="16"/>
+          <w:sz w:val="20"/>
+          <w:szCs w:val="20"/>
         </w:rPr>
         <w:t xml:space="preserve">[3]	J. Preskill, “Quantum computing in the NISQ era and beyond,” </w:t>
       </w:r>
@@ -9772,31 +9020,31 @@
           <w:rFonts w:ascii="Times New Roman" w:cs="Times New Roman" w:eastAsia="Times New Roman" w:hAnsi="Times New Roman"/>
           <w:i/>
           <w:iCs/>
-          <w:sz w:val="16"/>
-          <w:szCs w:val="16"/>
+          <w:sz w:val="20"/>
+          <w:szCs w:val="20"/>
         </w:rPr>
         <w:t xml:space="preserve">Quantum</w:t>
       </w:r>
       <w:r>
         <w:rPr>
           <w:rFonts w:ascii="Times New Roman" w:cs="Times New Roman" w:eastAsia="Times New Roman" w:hAnsi="Times New Roman"/>
-          <w:sz w:val="16"/>
-          <w:szCs w:val="16"/>
+          <w:sz w:val="20"/>
+          <w:szCs w:val="20"/>
         </w:rPr>
         <w:t xml:space="preserve">, vol. 2, p. 79, Aug. 2018.</w:t>
       </w:r>
     </w:p>
     <w:p>
       <w:pPr>
-        <w:spacing w:after="10" w:line="220"/>
-        <w:ind w:left="420" w:hanging="420"/>
+        <w:spacing w:after="15" w:line="235"/>
+        <w:ind w:left="520" w:hanging="520"/>
         <w:jc w:val="both"/>
       </w:pPr>
       <w:r>
         <w:rPr>
           <w:rFonts w:ascii="Times New Roman" w:cs="Times New Roman" w:eastAsia="Times New Roman" w:hAnsi="Times New Roman"/>
-          <w:sz w:val="16"/>
-          <w:szCs w:val="16"/>
+          <w:sz w:val="20"/>
+          <w:szCs w:val="20"/>
         </w:rPr>
         <w:t xml:space="preserve">[4]	Y. Zhu, A. Bouridane, M. E. Celebi, D. Konar, P. Angelov, Q. Ni, and R. Jiang, “Quantum face recognition with multigate quantum convolutional neural network,” </w:t>
       </w:r>
@@ -9805,31 +9053,31 @@
           <w:rFonts w:ascii="Times New Roman" w:cs="Times New Roman" w:eastAsia="Times New Roman" w:hAnsi="Times New Roman"/>
           <w:i/>
           <w:iCs/>
-          <w:sz w:val="16"/>
-          <w:szCs w:val="16"/>
+          <w:sz w:val="20"/>
+          <w:szCs w:val="20"/>
         </w:rPr>
         <w:t xml:space="preserve">IEEE Trans. Artif. Intell.</w:t>
       </w:r>
       <w:r>
         <w:rPr>
           <w:rFonts w:ascii="Times New Roman" w:cs="Times New Roman" w:eastAsia="Times New Roman" w:hAnsi="Times New Roman"/>
-          <w:sz w:val="16"/>
-          <w:szCs w:val="16"/>
+          <w:sz w:val="20"/>
+          <w:szCs w:val="20"/>
         </w:rPr>
         <w:t xml:space="preserve">, vol. 5, no. 12, pp. 6330–6341, Dec. 2024.</w:t>
       </w:r>
     </w:p>
     <w:p>
       <w:pPr>
-        <w:spacing w:after="10" w:line="220"/>
-        <w:ind w:left="420" w:hanging="420"/>
+        <w:spacing w:after="15" w:line="235"/>
+        <w:ind w:left="520" w:hanging="520"/>
         <w:jc w:val="both"/>
       </w:pPr>
       <w:r>
         <w:rPr>
           <w:rFonts w:ascii="Times New Roman" w:cs="Times New Roman" w:eastAsia="Times New Roman" w:hAnsi="Times New Roman"/>
-          <w:sz w:val="16"/>
-          <w:szCs w:val="16"/>
+          <w:sz w:val="20"/>
+          <w:szCs w:val="20"/>
         </w:rPr>
         <w:t xml:space="preserve">[5]	Y. LeCun </w:t>
       </w:r>
@@ -9838,16 +9086,16 @@
           <w:rFonts w:ascii="Times New Roman" w:cs="Times New Roman" w:eastAsia="Times New Roman" w:hAnsi="Times New Roman"/>
           <w:i/>
           <w:iCs/>
-          <w:sz w:val="16"/>
-          <w:szCs w:val="16"/>
+          <w:sz w:val="20"/>
+          <w:szCs w:val="20"/>
         </w:rPr>
         <w:t xml:space="preserve">et al.</w:t>
       </w:r>
       <w:r>
         <w:rPr>
           <w:rFonts w:ascii="Times New Roman" w:cs="Times New Roman" w:eastAsia="Times New Roman" w:hAnsi="Times New Roman"/>
-          <w:sz w:val="16"/>
-          <w:szCs w:val="16"/>
+          <w:sz w:val="20"/>
+          <w:szCs w:val="20"/>
         </w:rPr>
         <w:t xml:space="preserve">, “Backpropagation applied to handwritten zip code recognition,” </w:t>
       </w:r>
@@ -9856,31 +9104,31 @@
           <w:rFonts w:ascii="Times New Roman" w:cs="Times New Roman" w:eastAsia="Times New Roman" w:hAnsi="Times New Roman"/>
           <w:i/>
           <w:iCs/>
-          <w:sz w:val="16"/>
-          <w:szCs w:val="16"/>
+          <w:sz w:val="20"/>
+          <w:szCs w:val="20"/>
         </w:rPr>
         <w:t xml:space="preserve">Neural Comput.</w:t>
       </w:r>
       <w:r>
         <w:rPr>
           <w:rFonts w:ascii="Times New Roman" w:cs="Times New Roman" w:eastAsia="Times New Roman" w:hAnsi="Times New Roman"/>
-          <w:sz w:val="16"/>
-          <w:szCs w:val="16"/>
+          <w:sz w:val="20"/>
+          <w:szCs w:val="20"/>
         </w:rPr>
         <w:t xml:space="preserve">, vol. 1, no. 4, pp. 541–551, 1989.</w:t>
       </w:r>
     </w:p>
     <w:p>
       <w:pPr>
-        <w:spacing w:after="10" w:line="220"/>
-        <w:ind w:left="420" w:hanging="420"/>
+        <w:spacing w:after="15" w:line="235"/>
+        <w:ind w:left="520" w:hanging="520"/>
         <w:jc w:val="both"/>
       </w:pPr>
       <w:r>
         <w:rPr>
           <w:rFonts w:ascii="Times New Roman" w:cs="Times New Roman" w:eastAsia="Times New Roman" w:hAnsi="Times New Roman"/>
-          <w:sz w:val="16"/>
-          <w:szCs w:val="16"/>
+          <w:sz w:val="20"/>
+          <w:szCs w:val="20"/>
         </w:rPr>
         <w:t xml:space="preserve">[6]	Y. Taigman, M. Yang, M. Ranzato, and L. Wolf, “DeepFace: Closing the gap to human-level performance in face verification,” in </w:t>
       </w:r>
@@ -9889,31 +9137,31 @@
           <w:rFonts w:ascii="Times New Roman" w:cs="Times New Roman" w:eastAsia="Times New Roman" w:hAnsi="Times New Roman"/>
           <w:i/>
           <w:iCs/>
-          <w:sz w:val="16"/>
-          <w:szCs w:val="16"/>
+          <w:sz w:val="20"/>
+          <w:szCs w:val="20"/>
         </w:rPr>
         <w:t xml:space="preserve">Proc. IEEE CVPR</w:t>
       </w:r>
       <w:r>
         <w:rPr>
           <w:rFonts w:ascii="Times New Roman" w:cs="Times New Roman" w:eastAsia="Times New Roman" w:hAnsi="Times New Roman"/>
-          <w:sz w:val="16"/>
-          <w:szCs w:val="16"/>
+          <w:sz w:val="20"/>
+          <w:szCs w:val="20"/>
         </w:rPr>
         <w:t xml:space="preserve">, 2014, pp. 1701–1708.</w:t>
       </w:r>
     </w:p>
     <w:p>
       <w:pPr>
-        <w:spacing w:after="10" w:line="220"/>
-        <w:ind w:left="420" w:hanging="420"/>
+        <w:spacing w:after="15" w:line="235"/>
+        <w:ind w:left="520" w:hanging="520"/>
         <w:jc w:val="both"/>
       </w:pPr>
       <w:r>
         <w:rPr>
           <w:rFonts w:ascii="Times New Roman" w:cs="Times New Roman" w:eastAsia="Times New Roman" w:hAnsi="Times New Roman"/>
-          <w:sz w:val="16"/>
-          <w:szCs w:val="16"/>
+          <w:sz w:val="20"/>
+          <w:szCs w:val="20"/>
         </w:rPr>
         <w:t xml:space="preserve">[7]	M. Cerezo </w:t>
       </w:r>
@@ -9922,16 +9170,16 @@
           <w:rFonts w:ascii="Times New Roman" w:cs="Times New Roman" w:eastAsia="Times New Roman" w:hAnsi="Times New Roman"/>
           <w:i/>
           <w:iCs/>
-          <w:sz w:val="16"/>
-          <w:szCs w:val="16"/>
+          <w:sz w:val="20"/>
+          <w:szCs w:val="20"/>
         </w:rPr>
         <w:t xml:space="preserve">et al.</w:t>
       </w:r>
       <w:r>
         <w:rPr>
           <w:rFonts w:ascii="Times New Roman" w:cs="Times New Roman" w:eastAsia="Times New Roman" w:hAnsi="Times New Roman"/>
-          <w:sz w:val="16"/>
-          <w:szCs w:val="16"/>
+          <w:sz w:val="20"/>
+          <w:szCs w:val="20"/>
         </w:rPr>
         <w:t xml:space="preserve">, “Variational quantum algorithms,” </w:t>
       </w:r>
@@ -9940,31 +9188,31 @@
           <w:rFonts w:ascii="Times New Roman" w:cs="Times New Roman" w:eastAsia="Times New Roman" w:hAnsi="Times New Roman"/>
           <w:i/>
           <w:iCs/>
-          <w:sz w:val="16"/>
-          <w:szCs w:val="16"/>
+          <w:sz w:val="20"/>
+          <w:szCs w:val="20"/>
         </w:rPr>
         <w:t xml:space="preserve">Nat. Rev. Phys.</w:t>
       </w:r>
       <w:r>
         <w:rPr>
           <w:rFonts w:ascii="Times New Roman" w:cs="Times New Roman" w:eastAsia="Times New Roman" w:hAnsi="Times New Roman"/>
-          <w:sz w:val="16"/>
-          <w:szCs w:val="16"/>
+          <w:sz w:val="20"/>
+          <w:szCs w:val="20"/>
         </w:rPr>
         <w:t xml:space="preserve">, vol. 3, no. 9, pp. 625–644, 2021.</w:t>
       </w:r>
     </w:p>
     <w:p>
       <w:pPr>
-        <w:spacing w:after="10" w:line="220"/>
-        <w:ind w:left="420" w:hanging="420"/>
+        <w:spacing w:after="15" w:line="235"/>
+        <w:ind w:left="520" w:hanging="520"/>
         <w:jc w:val="both"/>
       </w:pPr>
       <w:r>
         <w:rPr>
           <w:rFonts w:ascii="Times New Roman" w:cs="Times New Roman" w:eastAsia="Times New Roman" w:hAnsi="Times New Roman"/>
-          <w:sz w:val="16"/>
-          <w:szCs w:val="16"/>
+          <w:sz w:val="20"/>
+          <w:szCs w:val="20"/>
         </w:rPr>
         <w:t xml:space="preserve">[8]	J. R. McClean, S. Boixo, V. N. Smelyanskiy, R. Babbush, and H. Neven, “Barren plateaus in quantum neural network training landscapes,” </w:t>
       </w:r>
@@ -9973,31 +9221,31 @@
           <w:rFonts w:ascii="Times New Roman" w:cs="Times New Roman" w:eastAsia="Times New Roman" w:hAnsi="Times New Roman"/>
           <w:i/>
           <w:iCs/>
-          <w:sz w:val="16"/>
-          <w:szCs w:val="16"/>
+          <w:sz w:val="20"/>
+          <w:szCs w:val="20"/>
         </w:rPr>
         <w:t xml:space="preserve">Nat. Commun.</w:t>
       </w:r>
       <w:r>
         <w:rPr>
           <w:rFonts w:ascii="Times New Roman" w:cs="Times New Roman" w:eastAsia="Times New Roman" w:hAnsi="Times New Roman"/>
-          <w:sz w:val="16"/>
-          <w:szCs w:val="16"/>
+          <w:sz w:val="20"/>
+          <w:szCs w:val="20"/>
         </w:rPr>
         <w:t xml:space="preserve">, vol. 9, Art. no. 4812, 2018.</w:t>
       </w:r>
     </w:p>
     <w:p>
       <w:pPr>
-        <w:spacing w:after="10" w:line="220"/>
-        <w:ind w:left="420" w:hanging="420"/>
+        <w:spacing w:after="15" w:line="235"/>
+        <w:ind w:left="520" w:hanging="520"/>
         <w:jc w:val="both"/>
       </w:pPr>
       <w:r>
         <w:rPr>
           <w:rFonts w:ascii="Times New Roman" w:cs="Times New Roman" w:eastAsia="Times New Roman" w:hAnsi="Times New Roman"/>
-          <w:sz w:val="16"/>
-          <w:szCs w:val="16"/>
+          <w:sz w:val="20"/>
+          <w:szCs w:val="20"/>
         </w:rPr>
         <w:t xml:space="preserve">[9]	Z. Holmes, K. Sharma, M. Cerezo, and P. J. Coles, “Connecting ansatz expressibility to gradient magnitudes and barren plateaus,” </w:t>
       </w:r>
@@ -10006,31 +9254,31 @@
           <w:rFonts w:ascii="Times New Roman" w:cs="Times New Roman" w:eastAsia="Times New Roman" w:hAnsi="Times New Roman"/>
           <w:i/>
           <w:iCs/>
-          <w:sz w:val="16"/>
-          <w:szCs w:val="16"/>
+          <w:sz w:val="20"/>
+          <w:szCs w:val="20"/>
         </w:rPr>
         <w:t xml:space="preserve">PRX Quantum</w:t>
       </w:r>
       <w:r>
         <w:rPr>
           <w:rFonts w:ascii="Times New Roman" w:cs="Times New Roman" w:eastAsia="Times New Roman" w:hAnsi="Times New Roman"/>
-          <w:sz w:val="16"/>
-          <w:szCs w:val="16"/>
+          <w:sz w:val="20"/>
+          <w:szCs w:val="20"/>
         </w:rPr>
         <w:t xml:space="preserve">, vol. 3, no. 1, Art. no. 010313, 2022.</w:t>
       </w:r>
     </w:p>
     <w:p>
       <w:pPr>
-        <w:spacing w:after="10" w:line="220"/>
-        <w:ind w:left="420" w:hanging="420"/>
+        <w:spacing w:after="15" w:line="235"/>
+        <w:ind w:left="520" w:hanging="520"/>
         <w:jc w:val="both"/>
       </w:pPr>
       <w:r>
         <w:rPr>
           <w:rFonts w:ascii="Times New Roman" w:cs="Times New Roman" w:eastAsia="Times New Roman" w:hAnsi="Times New Roman"/>
-          <w:sz w:val="16"/>
-          <w:szCs w:val="16"/>
+          <w:sz w:val="20"/>
+          <w:szCs w:val="20"/>
         </w:rPr>
         <w:t xml:space="preserve">[10]	I. Cong, S. Choi, and M. D. Lukin, “Quantum convolutional neural networks,” </w:t>
       </w:r>
@@ -10039,31 +9287,31 @@
           <w:rFonts w:ascii="Times New Roman" w:cs="Times New Roman" w:eastAsia="Times New Roman" w:hAnsi="Times New Roman"/>
           <w:i/>
           <w:iCs/>
-          <w:sz w:val="16"/>
-          <w:szCs w:val="16"/>
+          <w:sz w:val="20"/>
+          <w:szCs w:val="20"/>
         </w:rPr>
         <w:t xml:space="preserve">Nat. Phys.</w:t>
       </w:r>
       <w:r>
         <w:rPr>
           <w:rFonts w:ascii="Times New Roman" w:cs="Times New Roman" w:eastAsia="Times New Roman" w:hAnsi="Times New Roman"/>
-          <w:sz w:val="16"/>
-          <w:szCs w:val="16"/>
+          <w:sz w:val="20"/>
+          <w:szCs w:val="20"/>
         </w:rPr>
         <w:t xml:space="preserve">, vol. 15, no. 12, pp. 1273–1278, 2019.</w:t>
       </w:r>
     </w:p>
     <w:p>
       <w:pPr>
-        <w:spacing w:after="10" w:line="220"/>
-        <w:ind w:left="420" w:hanging="420"/>
+        <w:spacing w:after="15" w:line="235"/>
+        <w:ind w:left="520" w:hanging="520"/>
         <w:jc w:val="both"/>
       </w:pPr>
       <w:r>
         <w:rPr>
           <w:rFonts w:ascii="Times New Roman" w:cs="Times New Roman" w:eastAsia="Times New Roman" w:hAnsi="Times New Roman"/>
-          <w:sz w:val="16"/>
-          <w:szCs w:val="16"/>
+          <w:sz w:val="20"/>
+          <w:szCs w:val="20"/>
         </w:rPr>
         <w:t xml:space="preserve">[11]	M. Henderson, S. Shakya, S. Pradhan, and T. Cook, “Quanvolutional neural networks: Powering image recognition with quantum circuits,” </w:t>
       </w:r>
@@ -10072,31 +9320,31 @@
           <w:rFonts w:ascii="Times New Roman" w:cs="Times New Roman" w:eastAsia="Times New Roman" w:hAnsi="Times New Roman"/>
           <w:i/>
           <w:iCs/>
-          <w:sz w:val="16"/>
-          <w:szCs w:val="16"/>
+          <w:sz w:val="20"/>
+          <w:szCs w:val="20"/>
         </w:rPr>
         <w:t xml:space="preserve">Quantum Mach. Intell.</w:t>
       </w:r>
       <w:r>
         <w:rPr>
           <w:rFonts w:ascii="Times New Roman" w:cs="Times New Roman" w:eastAsia="Times New Roman" w:hAnsi="Times New Roman"/>
-          <w:sz w:val="16"/>
-          <w:szCs w:val="16"/>
+          <w:sz w:val="20"/>
+          <w:szCs w:val="20"/>
         </w:rPr>
         <w:t xml:space="preserve">, vol. 2, no. 1, 2020.</w:t>
       </w:r>
     </w:p>
     <w:p>
       <w:pPr>
-        <w:spacing w:after="10" w:line="220"/>
-        <w:ind w:left="420" w:hanging="420"/>
+        <w:spacing w:after="15" w:line="235"/>
+        <w:ind w:left="520" w:hanging="520"/>
         <w:jc w:val="both"/>
       </w:pPr>
       <w:r>
         <w:rPr>
           <w:rFonts w:ascii="Times New Roman" w:cs="Times New Roman" w:eastAsia="Times New Roman" w:hAnsi="Times New Roman"/>
-          <w:sz w:val="16"/>
-          <w:szCs w:val="16"/>
+          <w:sz w:val="20"/>
+          <w:szCs w:val="20"/>
         </w:rPr>
         <w:t xml:space="preserve">[12]	D. Mattern </w:t>
       </w:r>
@@ -10105,31 +9353,31 @@
           <w:rFonts w:ascii="Times New Roman" w:cs="Times New Roman" w:eastAsia="Times New Roman" w:hAnsi="Times New Roman"/>
           <w:i/>
           <w:iCs/>
-          <w:sz w:val="16"/>
-          <w:szCs w:val="16"/>
+          <w:sz w:val="20"/>
+          <w:szCs w:val="20"/>
         </w:rPr>
         <w:t xml:space="preserve">et al.</w:t>
       </w:r>
       <w:r>
         <w:rPr>
           <w:rFonts w:ascii="Times New Roman" w:cs="Times New Roman" w:eastAsia="Times New Roman" w:hAnsi="Times New Roman"/>
-          <w:sz w:val="16"/>
-          <w:szCs w:val="16"/>
+          <w:sz w:val="20"/>
+          <w:szCs w:val="20"/>
         </w:rPr>
         <w:t xml:space="preserve">, “Variational quanvolutional neural networks with enhanced image encoding,” arXiv:2106.07327, 2021.</w:t>
       </w:r>
     </w:p>
     <w:p>
       <w:pPr>
-        <w:spacing w:after="10" w:line="220"/>
-        <w:ind w:left="420" w:hanging="420"/>
+        <w:spacing w:after="15" w:line="235"/>
+        <w:ind w:left="520" w:hanging="520"/>
         <w:jc w:val="both"/>
       </w:pPr>
       <w:r>
         <w:rPr>
           <w:rFonts w:ascii="Times New Roman" w:cs="Times New Roman" w:eastAsia="Times New Roman" w:hAnsi="Times New Roman"/>
-          <w:sz w:val="16"/>
-          <w:szCs w:val="16"/>
+          <w:sz w:val="20"/>
+          <w:szCs w:val="20"/>
         </w:rPr>
         <w:t xml:space="preserve">[13]	S. Oh, J. Choi, and J. Kim, “A tutorial on quantum convolutional neural networks (QCNN),” in </w:t>
       </w:r>
@@ -10138,31 +9386,31 @@
           <w:rFonts w:ascii="Times New Roman" w:cs="Times New Roman" w:eastAsia="Times New Roman" w:hAnsi="Times New Roman"/>
           <w:i/>
           <w:iCs/>
-          <w:sz w:val="16"/>
-          <w:szCs w:val="16"/>
+          <w:sz w:val="20"/>
+          <w:szCs w:val="20"/>
         </w:rPr>
         <w:t xml:space="preserve">Proc. ICTC</w:t>
       </w:r>
       <w:r>
         <w:rPr>
           <w:rFonts w:ascii="Times New Roman" w:cs="Times New Roman" w:eastAsia="Times New Roman" w:hAnsi="Times New Roman"/>
-          <w:sz w:val="16"/>
-          <w:szCs w:val="16"/>
+          <w:sz w:val="20"/>
+          <w:szCs w:val="20"/>
         </w:rPr>
         <w:t xml:space="preserve">, 2020, pp. 236–239.</w:t>
       </w:r>
     </w:p>
     <w:p>
       <w:pPr>
-        <w:spacing w:after="10" w:line="220"/>
-        <w:ind w:left="420" w:hanging="420"/>
+        <w:spacing w:after="15" w:line="235"/>
+        <w:ind w:left="520" w:hanging="520"/>
         <w:jc w:val="both"/>
       </w:pPr>
       <w:r>
         <w:rPr>
           <w:rFonts w:ascii="Times New Roman" w:cs="Times New Roman" w:eastAsia="Times New Roman" w:hAnsi="Times New Roman"/>
-          <w:sz w:val="16"/>
-          <w:szCs w:val="16"/>
+          <w:sz w:val="20"/>
+          <w:szCs w:val="20"/>
         </w:rPr>
         <w:t xml:space="preserve">[14]	S. Y.-C. Chen, T.-C. Wei, C. Zhang, H. Yu, and S. Yoo, “Quantum convolutional neural networks for high energy physics data analysis,” </w:t>
       </w:r>
@@ -10171,46 +9419,46 @@
           <w:rFonts w:ascii="Times New Roman" w:cs="Times New Roman" w:eastAsia="Times New Roman" w:hAnsi="Times New Roman"/>
           <w:i/>
           <w:iCs/>
-          <w:sz w:val="16"/>
-          <w:szCs w:val="16"/>
+          <w:sz w:val="20"/>
+          <w:szCs w:val="20"/>
         </w:rPr>
         <w:t xml:space="preserve">Phys. Rev. Res.</w:t>
       </w:r>
       <w:r>
         <w:rPr>
           <w:rFonts w:ascii="Times New Roman" w:cs="Times New Roman" w:eastAsia="Times New Roman" w:hAnsi="Times New Roman"/>
-          <w:sz w:val="16"/>
-          <w:szCs w:val="16"/>
+          <w:sz w:val="20"/>
+          <w:szCs w:val="20"/>
         </w:rPr>
         <w:t xml:space="preserve">, vol. 4, no. 1, Art. no. 013231, 2022.</w:t>
       </w:r>
     </w:p>
     <w:p>
       <w:pPr>
-        <w:spacing w:after="10" w:line="220"/>
-        <w:ind w:left="420" w:hanging="420"/>
+        <w:spacing w:after="15" w:line="235"/>
+        <w:ind w:left="520" w:hanging="520"/>
         <w:jc w:val="both"/>
       </w:pPr>
       <w:r>
         <w:rPr>
           <w:rFonts w:ascii="Times New Roman" w:cs="Times New Roman" w:eastAsia="Times New Roman" w:hAnsi="Times New Roman"/>
-          <w:sz w:val="16"/>
-          <w:szCs w:val="16"/>
+          <w:sz w:val="20"/>
+          <w:szCs w:val="20"/>
         </w:rPr>
         <w:t xml:space="preserve">[15]	A. Senokosov, A. Sedykh, A. Sagingalieva, and A. Melnikov, “Quantum machine learning for image classification,” arXiv:2304.09224, 2023.</w:t>
       </w:r>
     </w:p>
     <w:p>
       <w:pPr>
-        <w:spacing w:after="10" w:line="220"/>
-        <w:ind w:left="420" w:hanging="420"/>
+        <w:spacing w:after="15" w:line="235"/>
+        <w:ind w:left="520" w:hanging="520"/>
         <w:jc w:val="both"/>
       </w:pPr>
       <w:r>
         <w:rPr>
           <w:rFonts w:ascii="Times New Roman" w:cs="Times New Roman" w:eastAsia="Times New Roman" w:hAnsi="Times New Roman"/>
-          <w:sz w:val="16"/>
-          <w:szCs w:val="16"/>
+          <w:sz w:val="20"/>
+          <w:szCs w:val="20"/>
         </w:rPr>
         <w:t xml:space="preserve">[16]	T. Hur, L. Kim, and D. K. Park, “Quantum convolutional neural network for classical data classification,” </w:t>
       </w:r>
@@ -10219,31 +9467,31 @@
           <w:rFonts w:ascii="Times New Roman" w:cs="Times New Roman" w:eastAsia="Times New Roman" w:hAnsi="Times New Roman"/>
           <w:i/>
           <w:iCs/>
-          <w:sz w:val="16"/>
-          <w:szCs w:val="16"/>
+          <w:sz w:val="20"/>
+          <w:szCs w:val="20"/>
         </w:rPr>
         <w:t xml:space="preserve">Quantum Mach. Intell.</w:t>
       </w:r>
       <w:r>
         <w:rPr>
           <w:rFonts w:ascii="Times New Roman" w:cs="Times New Roman" w:eastAsia="Times New Roman" w:hAnsi="Times New Roman"/>
-          <w:sz w:val="16"/>
-          <w:szCs w:val="16"/>
+          <w:sz w:val="20"/>
+          <w:szCs w:val="20"/>
         </w:rPr>
         <w:t xml:space="preserve">, vol. 4, no. 1, Art. no. 3, 2022.</w:t>
       </w:r>
     </w:p>
     <w:p>
       <w:pPr>
-        <w:spacing w:after="10" w:line="220"/>
-        <w:ind w:left="420" w:hanging="420"/>
+        <w:spacing w:after="15" w:line="235"/>
+        <w:ind w:left="520" w:hanging="520"/>
         <w:jc w:val="both"/>
       </w:pPr>
       <w:r>
         <w:rPr>
           <w:rFonts w:ascii="Times New Roman" w:cs="Times New Roman" w:eastAsia="Times New Roman" w:hAnsi="Times New Roman"/>
-          <w:sz w:val="16"/>
-          <w:szCs w:val="16"/>
+          <w:sz w:val="20"/>
+          <w:szCs w:val="20"/>
         </w:rPr>
         <w:t xml:space="preserve">[17]	F. S. Samaria and A. C. Harter, “Parameterisation of a stochastic model for human face identification,” in </w:t>
       </w:r>
@@ -10252,31 +9500,31 @@
           <w:rFonts w:ascii="Times New Roman" w:cs="Times New Roman" w:eastAsia="Times New Roman" w:hAnsi="Times New Roman"/>
           <w:i/>
           <w:iCs/>
-          <w:sz w:val="16"/>
-          <w:szCs w:val="16"/>
+          <w:sz w:val="20"/>
+          <w:szCs w:val="20"/>
         </w:rPr>
         <w:t xml:space="preserve">Proc. IEEE Workshop Appl. Comput. Vis.</w:t>
       </w:r>
       <w:r>
         <w:rPr>
           <w:rFonts w:ascii="Times New Roman" w:cs="Times New Roman" w:eastAsia="Times New Roman" w:hAnsi="Times New Roman"/>
-          <w:sz w:val="16"/>
-          <w:szCs w:val="16"/>
+          <w:sz w:val="20"/>
+          <w:szCs w:val="20"/>
         </w:rPr>
         <w:t xml:space="preserve">, 1994, pp. 138–142.</w:t>
       </w:r>
     </w:p>
     <w:p>
       <w:pPr>
-        <w:spacing w:after="10" w:line="220"/>
-        <w:ind w:left="420" w:hanging="420"/>
+        <w:spacing w:after="15" w:line="235"/>
+        <w:ind w:left="520" w:hanging="520"/>
         <w:jc w:val="both"/>
       </w:pPr>
       <w:r>
         <w:rPr>
           <w:rFonts w:ascii="Times New Roman" w:cs="Times New Roman" w:eastAsia="Times New Roman" w:hAnsi="Times New Roman"/>
-          <w:sz w:val="16"/>
-          <w:szCs w:val="16"/>
+          <w:sz w:val="20"/>
+          <w:szCs w:val="20"/>
         </w:rPr>
         <w:t xml:space="preserve">[18]	A. S. Georghiades, P. N. Belhumeur, and D. J. Kriegman, “From few to many: Generative models for recognition under variable pose and illumination,” in </w:t>
       </w:r>
@@ -10285,31 +9533,31 @@
           <w:rFonts w:ascii="Times New Roman" w:cs="Times New Roman" w:eastAsia="Times New Roman" w:hAnsi="Times New Roman"/>
           <w:i/>
           <w:iCs/>
-          <w:sz w:val="16"/>
-          <w:szCs w:val="16"/>
+          <w:sz w:val="20"/>
+          <w:szCs w:val="20"/>
         </w:rPr>
         <w:t xml:space="preserve">Proc. IEEE Int. Conf. Autom. Face Gesture Recognit.</w:t>
       </w:r>
       <w:r>
         <w:rPr>
           <w:rFonts w:ascii="Times New Roman" w:cs="Times New Roman" w:eastAsia="Times New Roman" w:hAnsi="Times New Roman"/>
-          <w:sz w:val="16"/>
-          <w:szCs w:val="16"/>
+          <w:sz w:val="20"/>
+          <w:szCs w:val="20"/>
         </w:rPr>
         <w:t xml:space="preserve">, 2000, pp. 277–284.</w:t>
       </w:r>
     </w:p>
     <w:p>
       <w:pPr>
-        <w:spacing w:after="10" w:line="220"/>
-        <w:ind w:left="420" w:hanging="420"/>
+        <w:spacing w:after="15" w:line="235"/>
+        <w:ind w:left="520" w:hanging="520"/>
         <w:jc w:val="both"/>
       </w:pPr>
       <w:r>
         <w:rPr>
           <w:rFonts w:ascii="Times New Roman" w:cs="Times New Roman" w:eastAsia="Times New Roman" w:hAnsi="Times New Roman"/>
-          <w:sz w:val="16"/>
-          <w:szCs w:val="16"/>
+          <w:sz w:val="20"/>
+          <w:szCs w:val="20"/>
         </w:rPr>
         <w:t xml:space="preserve">[19]	D. P. Kingma and J. Ba, “Adam: A method for stochastic optimization,” in </w:t>
       </w:r>
@@ -10318,31 +9566,31 @@
           <w:rFonts w:ascii="Times New Roman" w:cs="Times New Roman" w:eastAsia="Times New Roman" w:hAnsi="Times New Roman"/>
           <w:i/>
           <w:iCs/>
-          <w:sz w:val="16"/>
-          <w:szCs w:val="16"/>
+          <w:sz w:val="20"/>
+          <w:szCs w:val="20"/>
         </w:rPr>
         <w:t xml:space="preserve">Proc. ICLR</w:t>
       </w:r>
       <w:r>
         <w:rPr>
           <w:rFonts w:ascii="Times New Roman" w:cs="Times New Roman" w:eastAsia="Times New Roman" w:hAnsi="Times New Roman"/>
-          <w:sz w:val="16"/>
-          <w:szCs w:val="16"/>
+          <w:sz w:val="20"/>
+          <w:szCs w:val="20"/>
         </w:rPr>
         <w:t xml:space="preserve">, 2015.</w:t>
       </w:r>
     </w:p>
     <w:p>
       <w:pPr>
-        <w:spacing w:after="10" w:line="220"/>
-        <w:ind w:left="420" w:hanging="420"/>
+        <w:spacing w:after="15" w:line="235"/>
+        <w:ind w:left="520" w:hanging="520"/>
         <w:jc w:val="both"/>
       </w:pPr>
       <w:r>
         <w:rPr>
           <w:rFonts w:ascii="Times New Roman" w:cs="Times New Roman" w:eastAsia="Times New Roman" w:hAnsi="Times New Roman"/>
-          <w:sz w:val="16"/>
-          <w:szCs w:val="16"/>
+          <w:sz w:val="20"/>
+          <w:szCs w:val="20"/>
         </w:rPr>
         <w:t xml:space="preserve">[20]	V. Bergholm </w:t>
       </w:r>
@@ -10351,31 +9599,31 @@
           <w:rFonts w:ascii="Times New Roman" w:cs="Times New Roman" w:eastAsia="Times New Roman" w:hAnsi="Times New Roman"/>
           <w:i/>
           <w:iCs/>
-          <w:sz w:val="16"/>
-          <w:szCs w:val="16"/>
+          <w:sz w:val="20"/>
+          <w:szCs w:val="20"/>
         </w:rPr>
         <w:t xml:space="preserve">et al.</w:t>
       </w:r>
       <w:r>
         <w:rPr>
           <w:rFonts w:ascii="Times New Roman" w:cs="Times New Roman" w:eastAsia="Times New Roman" w:hAnsi="Times New Roman"/>
-          <w:sz w:val="16"/>
-          <w:szCs w:val="16"/>
+          <w:sz w:val="20"/>
+          <w:szCs w:val="20"/>
         </w:rPr>
         <w:t xml:space="preserve">, “PennyLane: Automatic differentiation of hybrid quantum-classical computations,” arXiv:1811.04968, 2018.</w:t>
       </w:r>
     </w:p>
     <w:p>
       <w:pPr>
-        <w:spacing w:after="10" w:line="220"/>
-        <w:ind w:left="420" w:hanging="420"/>
+        <w:spacing w:after="15" w:line="235"/>
+        <w:ind w:left="520" w:hanging="520"/>
         <w:jc w:val="both"/>
       </w:pPr>
       <w:r>
         <w:rPr>
           <w:rFonts w:ascii="Times New Roman" w:cs="Times New Roman" w:eastAsia="Times New Roman" w:hAnsi="Times New Roman"/>
-          <w:sz w:val="16"/>
-          <w:szCs w:val="16"/>
+          <w:sz w:val="20"/>
+          <w:szCs w:val="20"/>
         </w:rPr>
         <w:t xml:space="preserve">[21]	A. Paszke </w:t>
       </w:r>
@@ -10384,16 +9632,16 @@
           <w:rFonts w:ascii="Times New Roman" w:cs="Times New Roman" w:eastAsia="Times New Roman" w:hAnsi="Times New Roman"/>
           <w:i/>
           <w:iCs/>
-          <w:sz w:val="16"/>
-          <w:szCs w:val="16"/>
+          <w:sz w:val="20"/>
+          <w:szCs w:val="20"/>
         </w:rPr>
         <w:t xml:space="preserve">et al.</w:t>
       </w:r>
       <w:r>
         <w:rPr>
           <w:rFonts w:ascii="Times New Roman" w:cs="Times New Roman" w:eastAsia="Times New Roman" w:hAnsi="Times New Roman"/>
-          <w:sz w:val="16"/>
-          <w:szCs w:val="16"/>
+          <w:sz w:val="20"/>
+          <w:szCs w:val="20"/>
         </w:rPr>
         <w:t xml:space="preserve">, “PyTorch: An imperative style, high-performance deep learning library,” in </w:t>
       </w:r>
@@ -10402,31 +9650,31 @@
           <w:rFonts w:ascii="Times New Roman" w:cs="Times New Roman" w:eastAsia="Times New Roman" w:hAnsi="Times New Roman"/>
           <w:i/>
           <w:iCs/>
-          <w:sz w:val="16"/>
-          <w:szCs w:val="16"/>
+          <w:sz w:val="20"/>
+          <w:szCs w:val="20"/>
         </w:rPr>
         <w:t xml:space="preserve">Proc. NeurIPS</w:t>
       </w:r>
       <w:r>
         <w:rPr>
           <w:rFonts w:ascii="Times New Roman" w:cs="Times New Roman" w:eastAsia="Times New Roman" w:hAnsi="Times New Roman"/>
-          <w:sz w:val="16"/>
-          <w:szCs w:val="16"/>
+          <w:sz w:val="20"/>
+          <w:szCs w:val="20"/>
         </w:rPr>
         <w:t xml:space="preserve">, vol. 32, 2019, pp. 8026–8037.</w:t>
       </w:r>
     </w:p>
     <w:p>
       <w:pPr>
-        <w:spacing w:after="10" w:line="220"/>
-        <w:ind w:left="420" w:hanging="420"/>
+        <w:spacing w:after="15" w:line="235"/>
+        <w:ind w:left="520" w:hanging="520"/>
         <w:jc w:val="both"/>
       </w:pPr>
       <w:r>
         <w:rPr>
           <w:rFonts w:ascii="Times New Roman" w:cs="Times New Roman" w:eastAsia="Times New Roman" w:hAnsi="Times New Roman"/>
-          <w:sz w:val="16"/>
-          <w:szCs w:val="16"/>
+          <w:sz w:val="20"/>
+          <w:szCs w:val="20"/>
         </w:rPr>
         <w:t xml:space="preserve">[22]	K. Mitarai, M. Negoro, M. Kitagawa, and K. Fujii, “Quantum circuit learning,” </w:t>
       </w:r>
@@ -10435,31 +9683,31 @@
           <w:rFonts w:ascii="Times New Roman" w:cs="Times New Roman" w:eastAsia="Times New Roman" w:hAnsi="Times New Roman"/>
           <w:i/>
           <w:iCs/>
-          <w:sz w:val="16"/>
-          <w:szCs w:val="16"/>
+          <w:sz w:val="20"/>
+          <w:szCs w:val="20"/>
         </w:rPr>
         <w:t xml:space="preserve">Phys. Rev. A</w:t>
       </w:r>
       <w:r>
         <w:rPr>
           <w:rFonts w:ascii="Times New Roman" w:cs="Times New Roman" w:eastAsia="Times New Roman" w:hAnsi="Times New Roman"/>
-          <w:sz w:val="16"/>
-          <w:szCs w:val="16"/>
+          <w:sz w:val="20"/>
+          <w:szCs w:val="20"/>
         </w:rPr>
         <w:t xml:space="preserve">, vol. 98, no. 3, Art. no. 032309, 2018.</w:t>
       </w:r>
     </w:p>
     <w:p>
       <w:pPr>
-        <w:spacing w:after="10" w:line="220"/>
-        <w:ind w:left="420" w:hanging="420"/>
+        <w:spacing w:after="15" w:line="235"/>
+        <w:ind w:left="520" w:hanging="520"/>
         <w:jc w:val="both"/>
       </w:pPr>
       <w:r>
         <w:rPr>
           <w:rFonts w:ascii="Times New Roman" w:cs="Times New Roman" w:eastAsia="Times New Roman" w:hAnsi="Times New Roman"/>
-          <w:sz w:val="16"/>
-          <w:szCs w:val="16"/>
+          <w:sz w:val="20"/>
+          <w:szCs w:val="20"/>
         </w:rPr>
         <w:t xml:space="preserve">[23]	M. Schuld, V. Bergholm, C. Gogolin, J. Izaac, and N. Killoran, “Evaluating analytic gradients on quantum hardware,” </w:t>
       </w:r>
@@ -10468,16 +9716,16 @@
           <w:rFonts w:ascii="Times New Roman" w:cs="Times New Roman" w:eastAsia="Times New Roman" w:hAnsi="Times New Roman"/>
           <w:i/>
           <w:iCs/>
-          <w:sz w:val="16"/>
-          <w:szCs w:val="16"/>
+          <w:sz w:val="20"/>
+          <w:szCs w:val="20"/>
         </w:rPr>
         <w:t xml:space="preserve">Phys. Rev. A</w:t>
       </w:r>
       <w:r>
         <w:rPr>
           <w:rFonts w:ascii="Times New Roman" w:cs="Times New Roman" w:eastAsia="Times New Roman" w:hAnsi="Times New Roman"/>
-          <w:sz w:val="16"/>
-          <w:szCs w:val="16"/>
+          <w:sz w:val="20"/>
+          <w:szCs w:val="20"/>
         </w:rPr>
         <w:t xml:space="preserve">, vol. 99, no. 3, Art. no. 032331, 2019.</w:t>
       </w:r>

</xml_diff>